<commit_message>
feat: item preview with PGL and margin in admin offers, v2.1 badge
Admin /admin/oferty gets an expandable item table under each offer, like
/offers and /senior. The three copy-pasted tables are now one shared
OfferItemsPreview component, which adds PGL and margin (amount + %)
columns in the offer's frozen currency. Version badge bumped to v2.1 and
the change logged in the 2.1 version report.

Co-Authored-By: Claude Opus 5.5 <noreply@anthropic.com>
</commit_message>
<xml_diff>
--- a/Historia wersji oraz md/Historia wersji/AMSteel_Quote_Raport_Wersji_2.1.docx
+++ b/Historia wersji oraz md/Historia wersji/AMSteel_Quote_Raport_Wersji_2.1.docx
@@ -1144,7 +1144,9 @@
             <w:tcW w:w="1948" w:type="dxa"/>
           </w:tcPr>
           <w:p>
-            <w:r/>
+            <w:r>
+              <w:t>Nowa funkcja</w:t>
+            </w:r>
           </w:p>
         </w:tc>
         <w:tc>
@@ -1152,7 +1154,9 @@
             <w:tcW w:w="6908" w:type="dxa"/>
           </w:tcPr>
           <w:p>
-            <w:r/>
+            <w:r>
+              <w:t>Podgląd pozycji oferty w panelu Administratora (Oferty): pod numerem oferty przycisk „📦 N pozycji” rozwija pod wierszem tabelę pozycji (gatunek / wymiary, typ, cena, tonaż, wartość) - tak jak w Moich ofertach i panelu Starszego handlowca. Do wszystkich trzech tabel pozycji (Moje oferty, Starszy handlowiec, Administrator) dodano kolumny PGL (€/t) oraz Marża (€/t i %). Kwoty pokazywane są w walucie i po kursie zapisanym w ofercie; dla starszych pozycji bez zapisanego % marży procent wyliczany jest jak w kalkulatorze: marża / (PGL + dopłaty huty). Trzy dotąd skopiowane tabele zastąpiono jednym wspólnym komponentem.</w:t>
+            </w:r>
           </w:p>
         </w:tc>
       </w:tr>

</xml_diff>

<commit_message>
docs: re-saved v2.1 version report
Co-Authored-By: Claude Opus 5.5 <noreply@anthropic.com>
</commit_message>
<xml_diff>
--- a/Historia wersji oraz md/Historia wersji/AMSteel_Quote_Raport_Wersji_2.1.docx
+++ b/Historia wersji oraz md/Historia wersji/AMSteel_Quote_Raport_Wersji_2.1.docx
@@ -115,7 +115,13 @@
           </w:tcPr>
           <w:p>
             <w:r>
-              <w:t xml:space="preserve">14.10.2026 - </w:t>
+              <w:t>1</w:t>
+            </w:r>
+            <w:r>
+              <w:t>3</w:t>
+            </w:r>
+            <w:r>
+              <w:t xml:space="preserve">.10.2026 - </w:t>
             </w:r>
           </w:p>
         </w:tc>
@@ -139,9 +145,7 @@
           <w:tcPr>
             <w:tcW w:w="5669" w:type="dxa"/>
           </w:tcPr>
-          <w:p>
-            <w:r/>
-          </w:p>
+          <w:p/>
         </w:tc>
       </w:tr>
     </w:tbl>
@@ -260,7 +264,13 @@
           </w:tcPr>
           <w:p>
             <w:r>
-              <w:t xml:space="preserve">14.10.2026 - </w:t>
+              <w:t>1</w:t>
+            </w:r>
+            <w:r>
+              <w:t>3</w:t>
+            </w:r>
+            <w:r>
+              <w:t xml:space="preserve">.10.2026 - </w:t>
             </w:r>
           </w:p>
         </w:tc>
@@ -268,9 +278,7 @@
           <w:tcPr>
             <w:tcW w:w="1550" w:type="dxa"/>
           </w:tcPr>
-          <w:p>
-            <w:r/>
-          </w:p>
+          <w:p/>
         </w:tc>
         <w:tc>
           <w:tcPr>
@@ -309,16 +317,7 @@
               <w:t xml:space="preserve">.09.2026 - </w:t>
             </w:r>
             <w:r>
-              <w:t>13</w:t>
-            </w:r>
-            <w:r>
-              <w:t>.</w:t>
-            </w:r>
-            <w:r>
-              <w:t>10</w:t>
-            </w:r>
-            <w:r>
-              <w:t>.2026</w:t>
+              <w:t>13.10.2026</w:t>
             </w:r>
           </w:p>
         </w:tc>
@@ -338,7 +337,11 @@
           </w:tcPr>
           <w:p>
             <w:r>
-              <w:t>Panel Starszego handlowca: rozwijana tabela pozycji z cenami oraz lista pozycji poniżej wytycznych (marża / PGL). Walidacja (zatwierdź / odrzuć) także z poziomu kalkulatora. Powód odrzucenia oferty przez klienta jako lista rozwijana (z opcją „Inne” i własnym tekstem). Statystyki powodów odrzucenia w panelu Analiza. Przebudowa uprawnień: konfigurowalne flowy, role, poziomy hierarchii, reguły walidacji z symulatorem i macierz widoczności (panel „Uprawnienia”). Kafelki statusów w panelu weryfikującego, kolumna PGL i marża % w zestawieniu, skrót do ustawień dla administratora, walidacja spójności pozycji oferty po stronie serwera. Oferty wysłane da się otworzyć w trybie podglądu; ofertę przegraną można renegocjować jako kolejną wersję tej samej oferty, a analityka liczy całą renegocjację jako jedną ofertę (wynik ostatniej rundy). Odpowiedzi biznesu do modelu uprawnień wdrożone: Head of Projects zastępuje N+1 i N+2, zastępstwo wyższego poziomu, wysyłka tylko przez twórcę oferty, zatwierdzenie ważne 48 h, reguła marży N+2 = 2,1% lub mniej. Widok piramidy w panelu Handlowcy pokazuje zależności: kto komu podlega i kto jest w czyim zespole. Edytowalny cennik dopłat osobno dla każdego typu stali (panel administratora, historia zmian). Odstęp tysięcy (1 000 000) we wszystkich kwotach i tonażach w aplikacji oraz w PDF. Lista powodów przegranej prowadzona przez administratora (panel „Powody przegranej”, cztery języki, archiwizacja), wybór powodu przy przegranej obowiązkowy.</w:t>
+              <w:t xml:space="preserve">Panel Starszego handlowca: rozwijana tabela pozycji z cenami oraz lista pozycji poniżej wytycznych (marża / PGL). Walidacja (zatwierdź / odrzuć) także z poziomu kalkulatora. Powód odrzucenia oferty przez klienta jako lista rozwijana (z opcją „Inne” i własnym tekstem). Statystyki powodów odrzucenia w panelu Analiza. Przebudowa uprawnień: konfigurowalne flowy, role, poziomy hierarchii, reguły walidacji z symulatorem i macierz widoczności (panel „Uprawnienia”). Kafelki statusów w panelu weryfikującego, kolumna PGL i marża % w zestawieniu, skrót do ustawień dla administratora, walidacja spójności pozycji oferty po stronie serwera. Oferty wysłane da się otworzyć w trybie podglądu; ofertę przegraną można renegocjować jako kolejną wersję tej samej oferty, a analityka liczy całą renegocjację jako jedną ofertę (wynik ostatniej rundy). Odpowiedzi biznesu do modelu </w:t>
+            </w:r>
+            <w:r>
+              <w:lastRenderedPageBreak/>
+              <w:t>uprawnień wdrożone: Head of Projects zastępuje N+1 i N+2, zastępstwo wyższego poziomu, wysyłka tylko przez twórcę oferty, zatwierdzenie ważne 48 h, reguła marży N+2 = 2,1% lub mniej. Widok piramidy w panelu Handlowcy pokazuje zależności: kto komu podlega i kto jest w czyim zespole. Edytowalny cennik dopłat osobno dla każdego typu stali (panel administratora, historia zmian). Odstęp tysięcy (1 000 000) we wszystkich kwotach i tonażach w aplikacji oraz w PDF. Lista powodów przegranej prowadzona przez administratora (panel „Powody przegranej”, cztery języki, archiwizacja), wybór powodu przy przegranej obowiązkowy.</w:t>
             </w:r>
           </w:p>
         </w:tc>
@@ -350,6 +353,7 @@
           </w:tcPr>
           <w:p>
             <w:r>
+              <w:lastRenderedPageBreak/>
               <w:t>1.9</w:t>
             </w:r>
           </w:p>
@@ -383,11 +387,11 @@
           </w:tcPr>
           <w:p>
             <w:r>
-              <w:t xml:space="preserve">Naprawiono podatność XSS w komunikatach ostrzegawczych kalkulatora o grubości/szerokości poza zakresem tabeli - wartości wstawiane do tych komunikatów (wcześniej bez oczyszczenia, przez dangerouslySetInnerHTML) są teraz oczyszczane (funkcja formatWarning w lib/translations.ts). Na liście „Moje oferty” dodano linię z firmą klienta i numerem SAP bezpośrednio pod numerem oferty, nad nazwą własną oferty, z placeholderem dla ofert bez jeszcze uzupełnionych danych klienta; zmiana obejmuje wszystkie 4 języki interfejsu. Wyszukiwarka i sortowanie na liście ofert rozszerzone o firmę klienta i numer SAP ID (dodatkowo w panelach Starszego handlowca i Administratora pojawiło się sortowanie, którego wcześniej tam w ogóle nie było). Plakietka statusu na liście „Moje oferty” skrócona - powód odrzucenia/przegranej pokazuje się teraz zwięźle obok numeru oferty </w:t>
+              <w:t xml:space="preserve">Naprawiono podatność XSS w komunikatach ostrzegawczych kalkulatora o grubości/szerokości poza zakresem tabeli - wartości wstawiane do tych komunikatów (wcześniej bez oczyszczenia, przez dangerouslySetInnerHTML) są teraz oczyszczane (funkcja formatWarning w lib/translations.ts). Na liście „Moje oferty” dodano linię z firmą klienta i numerem SAP bezpośrednio pod numerem oferty, nad nazwą własną oferty, z placeholderem dla ofert bez jeszcze uzupełnionych danych klienta; zmiana obejmuje wszystkie 4 języki interfejsu. Wyszukiwarka i sortowanie na liście ofert rozszerzone o firmę klienta i numer SAP ID (dodatkowo w panelach Starszego handlowca i Administratora pojawiło się sortowanie, którego wcześniej tam w ogóle nie było). Plakietka statusu na liście „Moje oferty” skrócona - powód odrzucenia/przegranej pokazuje się teraz zwięźle obok numeru oferty zamiast w osobnym dużym czerwonym bloku pod nazwą firmy. W Zestawieniu dodano widoczną </w:t>
             </w:r>
             <w:r>
               <w:lastRenderedPageBreak/>
-              <w:t>zamiast w osobnym dużym czerwonym bloku pod nazwą firmy. W Zestawieniu dodano widoczną plakietkę z kosztem transportu pozycji z listy i naprawiono zaniżanie stawki transportu €/t na już dodanych pozycjach, powodowane przez niedodany jeszcze szkic kolejnej pozycji w formularzu kalkulatora. Poprawiono też responsywność całej aplikacji na wąskich ekranach telefonu w orientacji pionowej (ok. 375 px szerokości) - nagłówki i nawigację, kalkulator, listę „Moje oferty”, panele administratora oraz panel Analiza i Starszego handlowca; widok na komputerze i w poziomej orientacji telefonu pozostaje bez zmian. Zamieniono też termin płatności w kalkulatorze i panelu klientów z pary pól dat na przyciski gotowych wartości dni (0/</w:t>
+              <w:t>plakietkę z kosztem transportu pozycji z listy i naprawiono zaniżanie stawki transportu €/t na już dodanych pozycjach, powodowane przez niedodany jeszcze szkic kolejnej pozycji w formularzu kalkulatora. Poprawiono też responsywność całej aplikacji na wąskich ekranach telefonu w orientacji pionowej (ok. 375 px szerokości) - nagłówki i nawigację, kalkulator, listę „Moje oferty”, panele administratora oraz panel Analiza i Starszego handlowca; widok na komputerze i w poziomej orientacji telefonu pozostaje bez zmian. Zamieniono też termin płatności w kalkulatorze i panelu klientów z pary pól dat na przyciski gotowych wartości dni (0/</w:t>
             </w:r>
             <w:r>
               <w:t>2/</w:t>
@@ -399,11 +403,11 @@
               <w:t xml:space="preserve"> </w:t>
             </w:r>
             <w:r>
-              <w:t xml:space="preserve">i naprawiono zawijanie się symbolu waluty w PDF przy bardzo dużych kwotach (powyżej 1 000 000 €). Okres ważności oferty dostał te same gotowe przyciski (Q1–Q4/„Ten miesiąc”/„Niestandardowy”) co termin płatności, z domyślnym okresem i 2-dniowym terminem dla nowej oferty bez klienta; przywrócono też do stopki PDF linijkę o 48-godzinnej ważności oferty, teraz liczoną z wybranego terminu płatności zamiast na sztywno. Naprawiono też analogiczne do walutowego ucinanie bardzo dużych wartości tonażu w PDF. Okres ważności oferty: przyciski Q1–Q4 pokazują teraz tylko kwartały wybranego roku, które jeszcze się nie zakończyły – dla roku bieżącego znikają więc już minione kwartały (np. we wrześniu widoczne są tylko Q3 i Q4), tak by handlowiec nie mógł wystawić nowej oferty z okresem ważności całkowicie w przeszłości; nowo odslonięte kwartały po zmianie na kolejny rok pojawiają się z krótką </w:t>
+              <w:t xml:space="preserve">i naprawiono zawijanie się symbolu waluty w PDF przy bardzo dużych kwotach (powyżej 1 000 000 €). Okres ważności oferty dostał te same gotowe przyciski (Q1–Q4/„Ten miesiąc”/„Niestandardowy”) co termin płatności, z domyślnym okresem i 2-dniowym terminem dla nowej oferty bez klienta; przywrócono też do stopki PDF linijkę o 48-godzinnej ważności oferty, teraz liczoną z wybranego terminu płatności zamiast na sztywno. Naprawiono też analogiczne do walutowego ucinanie bardzo dużych wartości tonażu w PDF. Okres ważności oferty: przyciski Q1–Q4 pokazują teraz tylko kwartały wybranego roku, które jeszcze się nie zakończyły – dla roku bieżącego znikają więc już minione kwartały (np. we wrześniu widoczne są tylko Q3 i Q4), tak by handlowiec nie mógł wystawić nowej oferty z okresem ważności całkowicie w przeszłości; nowo odslonięte kwartały po zmianie na kolejny rok pojawiają się z krótką animacją zamiast skokowo. Panel „Analiza” zyskał zamykalne plakietki aktywnego zawężenia </w:t>
             </w:r>
             <w:r>
               <w:lastRenderedPageBreak/>
-              <w:t>animacją zamiast skokowo. Panel „Analiza” zyskał zamykalne plakietki aktywnego zawężenia (handlowiec/typ stali/status/decyzja klienta/firma) widoczne zarówno w zbiorczym pasku na górze, jak i przy powiązanym panelu oraz eksporcie do Excela. Panel „Handlowcy” administratora dostał zakładki filtrowania po roli z licznikiem kont, a lista ofert administratora pokazuje zamykalną plakietkę handlowca, gdy jest już zawężona do konkretnej osoby. Dodano przycisk „2” w wyborze terminu płatności (kalkulator, panel „Klienci”), tak by domyślny 2-dniowy termin nowej oferty pokazywał się jako gotowy wybór zamiast wartości wpisanej w polu „Inny”. Panel „Handlowcy” w Analizie zyskał też przełącznik filtrujący ranking wyników wg roli (Wszystko/młodszy handlowiec/starszy handlowiec/administrator), z przeliczeniem udziałów procentowych i wiersza „Razem” dla zawężonej grupy. Dodano też w kalkulatorze krótką plakietkę informacyjną przy wyborze okresu ważności oferty na kwartał inny niż bieżący, gdy PGL zaplanowane na ten kwartał różni się od aktualnie obowiązującego, tak by handlowiec od razu widział, że wycena jedzie na innej cenie wsadu. Dodano też podstawową infrastrukturę PWA (manifest, ikony, service worker) z plakietką instalacji aplikacji widoczną wyłącznie na ekranie logowania na telefonach z Androidem, znikającą automatycznie po zalogowaniu. Nagłówek sekcji „Trasa i transport” w Zestawieniu wyróżniono pogrubieniem i kolorem akcentu, żeby było wyraźniej widać, że to klikalny przycisk rozwijający panel.</w:t>
+              <w:t>(handlowiec/typ stali/status/decyzja klienta/firma) widoczne zarówno w zbiorczym pasku na górze, jak i przy powiązanym panelu oraz eksporcie do Excela. Panel „Handlowcy” administratora dostał zakładki filtrowania po roli z licznikiem kont, a lista ofert administratora pokazuje zamykalną plakietkę handlowca, gdy jest już zawężona do konkretnej osoby. Dodano przycisk „2” w wyborze terminu płatności (kalkulator, panel „Klienci”), tak by domyślny 2-dniowy termin nowej oferty pokazywał się jako gotowy wybór zamiast wartości wpisanej w polu „Inny”. Panel „Handlowcy” w Analizie zyskał też przełącznik filtrujący ranking wyników wg roli (Wszystko/młodszy handlowiec/starszy handlowiec/administrator), z przeliczeniem udziałów procentowych i wiersza „Razem” dla zawężonej grupy. Dodano też w kalkulatorze krótką plakietkę informacyjną przy wyborze okresu ważności oferty na kwartał inny niż bieżący, gdy PGL zaplanowane na ten kwartał różni się od aktualnie obowiązującego, tak by handlowiec od razu widział, że wycena jedzie na innej cenie wsadu. Dodano też podstawową infrastrukturę PWA (manifest, ikony, service worker) z plakietką instalacji aplikacji widoczną wyłącznie na ekranie logowania na telefonach z Androidem, znikającą automatycznie po zalogowaniu. Nagłówek sekcji „Trasa i transport” w Zestawieniu wyróżniono pogrubieniem i kolorem akcentu, żeby było wyraźniej widać, że to klikalny przycisk rozwijający panel.</w:t>
             </w:r>
           </w:p>
         </w:tc>
@@ -458,25 +462,25 @@
           </w:tcPr>
           <w:p>
             <w:r>
-              <w:t xml:space="preserve">Dodano opcjonalny komentarz do pozycji z niezerową dopłatą dodatkową w kalkulatorze. Pole </w:t>
+              <w:t xml:space="preserve">Dodano opcjonalny komentarz do pozycji z niezerową dopłatą dodatkową w kalkulatorze. Pole komentarza oraz osobny checkbox „Dołącz komentarz do PDF” pojawiają się dopiero po wpisaniu wartości </w:t>
             </w:r>
             <w:r>
               <w:lastRenderedPageBreak/>
-              <w:t xml:space="preserve">komentarza oraz osobny checkbox „Dołącz komentarz do PDF” pojawiają się dopiero po wpisaniu wartości różnej od zera, a treść zapisuje się razem z resztą konfiguracji pozycji (odtwarzana przy edycji, nieusuwana przy chwilowym wyzerowaniu dopłaty). Po zaznaczeniu checkboxa komentarz trafia jako dodatkowy wpis do kolumny „Uwagi” w PDF oferty, we wszystkich miejscach eksportu (kalkulator, Moje oferty, Panel seniora, Panel administratora). Dodano również gatunek jednorazowy - możliwość wyceny gatunku spoza cennika (nazwa + dopłata EUR/t) w obrębie jednej oferty, bez dopisywania go do cennika i bez wpływu na pozostałe oferty. Dodano też opcję odbioru własnego w transporcie - checkbox w panelu „Trasa i transport” ustawia transport na 0 €/t, gdy klient sam odbiera towar spod zakładu. Dodano też harmonogram kwartalny PGL bazowego: administrator planuje ceny na Q1–Q4 wybranego roku osobno dla każdego typu stali, a kalkulator przełącza się na cenę danego kwartału automatycznie z chwilą jego rozpoczęcia. Tabela w panelu administratora pokazuje obok siebie cenę bieżącego miesiąca i wszystkie cztery kwartały. Funkcja wymaga migracji bazy danych (021_create_pgl_quarterly_prices.sql). Poprawiono też zapis ustawień, który przy aktywnej cenie kwartalnej nadpisywał nią ręczną cenę bazową PGL, oraz zaktualizowano dokumentację repozytorium (README, opis „About” na GitHubie, zrzuty ekranu kalkulatora) i numer wersji w nagłówku aplikacji do v1.8. Cały panel kalkulacji zyskał też zwijanie/rozwijanie jednym kliknięciem, analogicznie do panelu Danych Klienta. Ostrzeżenia o PGL </w:t>
+              <w:t xml:space="preserve">różnej od zera, a treść zapisuje się razem z resztą konfiguracji pozycji (odtwarzana przy edycji, nieusuwana przy chwilowym wyzerowaniu dopłaty). Po zaznaczeniu checkboxa komentarz trafia jako dodatkowy wpis do kolumny „Uwagi” w PDF oferty, we wszystkich miejscach eksportu (kalkulator, Moje oferty, Panel seniora, Panel administratora). Dodano również gatunek jednorazowy - możliwość wyceny gatunku spoza cennika (nazwa + dopłata EUR/t) w obrębie jednej oferty, bez dopisywania go do cennika i bez wpływu na pozostałe oferty. Dodano też opcję odbioru własnego w transporcie - checkbox w panelu „Trasa i transport” ustawia transport na 0 €/t, gdy klient sam odbiera towar spod zakładu. Dodano też harmonogram kwartalny PGL bazowego: administrator planuje ceny na Q1–Q4 wybranego roku osobno dla każdego typu stali, a kalkulator przełącza się na cenę danego kwartału automatycznie z chwilą jego rozpoczęcia. Tabela w panelu administratora pokazuje obok siebie cenę bieżącego miesiąca i wszystkie cztery kwartały. Funkcja wymaga migracji bazy danych (021_create_pgl_quarterly_prices.sql). Poprawiono też zapis ustawień, który przy aktywnej cenie kwartalnej nadpisywał nią ręczną cenę bazową PGL, oraz zaktualizowano dokumentację repozytorium (README, opis „About” na GitHubie, zrzuty ekranu kalkulatora) i numer wersji w nagłówku aplikacji do v1.8. Cały panel kalkulacji zyskał też zwijanie/rozwijanie jednym kliknięciem, analogicznie do panelu Danych Klienta. Ostrzeżenia o PGL poniżej bazy i marży poniżej minimum stały się też wyraźnie widoczne - zamiast drobnego żółtego tekstu </w:t>
             </w:r>
             <w:r>
               <w:lastRenderedPageBreak/>
-              <w:t xml:space="preserve">poniżej bazy i marży poniżej minimum stały się też wyraźnie widoczne - zamiast drobnego żółtego tekstu pokazują się teraz jako czerwono obramowany, pogrubiony komunikat. Złom w podsumowaniu SSC przestał być stałą kwotą 10 €/t - jest teraz % ceny wsadu (domyślnie 2%), konfigurowalny przez administratora w Ustawieniach. Poprawiono też historię zmian cen bazowych PGL, która nie rejestrowała zmian wprowadzanych przez harmonogram kwartalny (edycję ceny bieżącego kwartału) - teraz trafiają do tego samego logu co ręczne zmiany. Dodano też okres ważności oferty: pola „Ważna od”/„Ważna do” obok przełącznika Arkusz/Krąg. Kwartał wyznaczony z daty „Ważna od” automatycznie dobiera PGL bazowe zaplanowane w harmonogramie kwartalnym dla tego okresu, tą samą logiką co dotychczasowe przełączanie na bieżący kwartał - tylko sparametryzowaną wybranym okresem zamiast „teraz”. Gdy zakres „od”–„do” wykracza poza jeden kwartał, PGL nie jest dobierane automatycznie i pojawia się czerwone ostrzeżenie. Wybrany zakres dat trafia też dodatkowo do stopki PDF oferty, obok dotychczasowej formułki o 48-godzinnej ważności oferty. Kwota złomu w podsumowaniu SSC jest teraz zaokrąglana do liczby całkowitej, na polecenie </w:t>
+              <w:t xml:space="preserve">pokazują się teraz jako czerwono obramowany, pogrubiony komunikat. Złom w podsumowaniu SSC przestał być stałą kwotą 10 €/t - jest teraz % ceny wsadu (domyślnie 2%), konfigurowalny przez administratora w Ustawieniach. Poprawiono też historię zmian cen bazowych PGL, która nie rejestrowała zmian wprowadzanych przez harmonogram kwartalny (edycję ceny bieżącego kwartału) - teraz trafiają do tego samego logu co ręczne zmiany. Dodano też okres ważności oferty: pola „Ważna od”/„Ważna do” obok przełącznika Arkusz/Krąg. Kwartał wyznaczony z daty „Ważna od” automatycznie dobiera PGL bazowe zaplanowane w harmonogramie kwartalnym dla tego okresu, tą samą logiką co dotychczasowe przełączanie na bieżący kwartał - tylko sparametryzowaną wybranym okresem zamiast „teraz”. Gdy zakres „od”–„do” wykracza poza jeden kwartał, PGL nie jest dobierane automatycznie i pojawia się czerwone ostrzeżenie. Wybrany zakres dat trafia też dodatkowo do stopki PDF oferty, obok dotychczasowej formułki o 48-godzinnej ważności oferty. Kwota złomu w podsumowaniu SSC jest teraz zaokrąglana do liczby całkowitej, na polecenie </w:t>
             </w:r>
             <w:r>
               <w:t>Łukasza</w:t>
             </w:r>
             <w:r>
-              <w:t xml:space="preserve">. Dodano też termin płatności: osobna para pól „od”/„do” obok okresu ważności oferty, gdzie „do” domyślnie dolicza się jako „od” + termin klienta (konfigurowalny w panelu Klienci, dostępnym też dla starszego handlowca) albo globalny domyślny z Ustawień (domyślnie 7 dni), z możliwością ręcznej zmiany; ustawiony termin trafia też do stopki PDF, zastępując ogólną formułkę o warunkach płatności. Poprawiono też </w:t>
+              <w:t xml:space="preserve">. Dodano też termin płatności: osobna para pól „od”/„do” obok okresu ważności oferty, gdzie „do” domyślnie dolicza się jako „od” + termin klienta (konfigurowalny w panelu Klienci, dostępnym też dla starszego handlowca) albo globalny domyślny z Ustawień (domyślnie 7 dni), z możliwością ręcznej zmiany; ustawiony termin trafia też do stopki PDF, zastępując ogólną formułkę o warunkach płatności. Poprawiono też PDF oferty: podsumowanie sumy przestało powtarzać się po każdej stronie tabeli pozycji (pokazuje się </w:t>
             </w:r>
             <w:r>
               <w:lastRenderedPageBreak/>
-              <w:t>PDF oferty: podsumowanie sumy przestało powtarzać się po każdej stronie tabeli pozycji (pokazuje się teraz raz, po ostatniej pozycji), a tekst w kolumnach „Cena”/„Wartość” przestał się rozjeżdżać przy pięciocyfrowych kwotach. W zestawieniu pozycji doszła możliwość zmiany kolejności wierszy przeciąganiem za uchwyt, z automatycznym przeliczeniem numeracji „Lp.” i płynną animacją przesuwania pozostałych pozycji - nowa kolejność obowiązuje też w PDF, Excelu i zapisanej ofercie; funkcja działa również dotykiem na telefonie i tablecie, nie tylko myszką. Podsumowanie zestawienia pozycji pokazuje teraz również łączną liczbę ton, wyrównaną w wierszu podsumowującym dokładnie pod kolumnami „Tony” i „Wartość” tabeli. Dodano też migrację przeterminowanego PGL: otwarcie do edycji zapisanej oferty (albo świeżo zduplikowanej kopii) wycenionej w innym kwartale niż bieżący automatycznie aktualizuje PGL bazowe, PGL/marżę/cenę każdej pozycji zestawienia oraz okres ważności do dzisiejszej daty, z wyraźnym banerem informującym o zmianie i liczbie przeliczonych pozycji; nic nie zapisuje się do bazy bez ręcznego zapisania oferty.</w:t>
+              <w:t>teraz raz, po ostatniej pozycji), a tekst w kolumnach „Cena”/„Wartość” przestał się rozjeżdżać przy pięciocyfrowych kwotach. W zestawieniu pozycji doszła możliwość zmiany kolejności wierszy przeciąganiem za uchwyt, z automatycznym przeliczeniem numeracji „Lp.” i płynną animacją przesuwania pozostałych pozycji - nowa kolejność obowiązuje też w PDF, Excelu i zapisanej ofercie; funkcja działa również dotykiem na telefonie i tablecie, nie tylko myszką. Podsumowanie zestawienia pozycji pokazuje teraz również łączną liczbę ton, wyrównaną w wierszu podsumowującym dokładnie pod kolumnami „Tony” i „Wartość” tabeli. Dodano też migrację przeterminowanego PGL: otwarcie do edycji zapisanej oferty (albo świeżo zduplikowanej kopii) wycenionej w innym kwartale niż bieżący automatycznie aktualizuje PGL bazowe, PGL/marżę/cenę każdej pozycji zestawienia oraz okres ważności do dzisiejszej daty, z wyraźnym banerem informującym o zmianie i liczbie przeliczonych pozycji; nic nie zapisuje się do bazy bez ręcznego zapisania oferty.</w:t>
             </w:r>
           </w:p>
         </w:tc>
@@ -519,11 +523,11 @@
           </w:tcPr>
           <w:p>
             <w:r>
-              <w:t xml:space="preserve">Naprawiono błąd zapisu decyzji klienta (wygrana / przegrana) na ofercie wysłanej - konflikt typów parametru w zapytaniu SQL (kod 42P08); wcześniej funkcja nie zapisywała żadnej decyzji. Zablokowano wysyłkę oferty do klienta bez danych firmy klienta (nazwa firmy i NIP) - tworzenie i zapis oferty bez tych danych nadal działają. Senior może zbudować zespół z juniorów (sekcja „Mój zespół” w panelu seniora i administratora), a </w:t>
+              <w:t xml:space="preserve">Naprawiono błąd zapisu decyzji klienta (wygrana / przegrana) na ofercie wysłanej - konflikt typów parametru w zapytaniu SQL (kod 42P08); wcześniej funkcja nie zapisywała żadnej decyzji. Zablokowano wysyłkę oferty do klienta bez danych firmy klienta (nazwa firmy i NIP) - tworzenie i zapis oferty bez tych danych nadal działają. Senior może zbudować zespół z juniorów (sekcja „Mój zespół” w panelu seniora i administratora), a panel „Analiza” pokazuje mu wtedy dane własne oraz całego zespołu, z możliwością zawężenia do siebie lub </w:t>
             </w:r>
             <w:r>
               <w:lastRenderedPageBreak/>
-              <w:t>panel „Analiza” pokazuje mu wtedy dane własne oraz całego zespołu, z możliwością zawężenia do siebie lub wybranego juniora. Eksport ofert, panelu „Analiza” i historii PGL do Excela otwiera się teraz z kolumnami dopasowanymi do zawartości, bez ręcznego rozciągania. Dodano automatyczne liczenie transportu z trasy dostawy: rzeczywista odległość drogowa do klienta, cennik przewoźnika w pasmach kilometrowych, przeliczanie na kursy według ładowności 21 t i dopłaty za elementy ponadwymiarowe, wraz z edytowalnym cennikiem w panelu administratora. Wysoki kontrast (jasny i ciemny) przeszedł na nowoczesną paletę kolorów wspólną ze zwykłym motywem – zamiast czerni-na-bieli tryb ten daje teraz większą czcionkę, powiększony widok i grubsze obramowania przy firmowych kolorach. Naprawiono też fałszywe ostrzeżenie o niezapisanych zmianach po rozpoczęciu nowej oferty w trakcie edycji zapisanej – pojawiało się mimo pustego, niezmienionego formularza. Blacha łezkowa otrzymała dopłatę wymiarową zależną od szerokości (30 €/t do 1,5 m, 45 €/t powyżej) oraz własną tabelę gatunków z domyślnym S235JR+N. Wersja 1.7 została wdrożona na środowisko produkcyjne 10.09.2026 wraz z migracjami 019 (zespoły seniora, tabela „team_members”) i 020 (cennik transportowy, tabele „transport_tariff_bands” i „route_cache”); wdrożenie zakończone powodzeniem.</w:t>
+              <w:t>wybranego juniora. Eksport ofert, panelu „Analiza” i historii PGL do Excela otwiera się teraz z kolumnami dopasowanymi do zawartości, bez ręcznego rozciągania. Dodano automatyczne liczenie transportu z trasy dostawy: rzeczywista odległość drogowa do klienta, cennik przewoźnika w pasmach kilometrowych, przeliczanie na kursy według ładowności 21 t i dopłaty za elementy ponadwymiarowe, wraz z edytowalnym cennikiem w panelu administratora. Wysoki kontrast (jasny i ciemny) przeszedł na nowoczesną paletę kolorów wspólną ze zwykłym motywem – zamiast czerni-na-bieli tryb ten daje teraz większą czcionkę, powiększony widok i grubsze obramowania przy firmowych kolorach. Naprawiono też fałszywe ostrzeżenie o niezapisanych zmianach po rozpoczęciu nowej oferty w trakcie edycji zapisanej – pojawiało się mimo pustego, niezmienionego formularza. Blacha łezkowa otrzymała dopłatę wymiarową zależną od szerokości (30 €/t do 1,5 m, 45 €/t powyżej) oraz własną tabelę gatunków z domyślnym S235JR+N. Wersja 1.7 została wdrożona na środowisko produkcyjne 10.09.2026 wraz z migracjami 019 (zespoły seniora, tabela „team_members”) i 020 (cennik transportowy, tabele „transport_tariff_bands” i „route_cache”); wdrożenie zakończone powodzeniem.</w:t>
             </w:r>
           </w:p>
         </w:tc>
@@ -566,15 +570,15 @@
           </w:tcPr>
           <w:p>
             <w:r>
-              <w:t xml:space="preserve">Uzupełniono tabelę gatunków PICKLED (HRS Trawiona) o brakujący zakres SAPH 440 -&gt; DD12 wraz z dodatkowymi gatunkami (K367-DD14+B, FE 600 DP, S300EK, P265GH, P275SL, P355NL2, SA516G60-LOWSI, S240 D), na podstawie danych </w:t>
+              <w:t xml:space="preserve">Uzupełniono tabelę gatunków PICKLED (HRS Trawiona) o brakujący zakres SAPH 440 -&gt; DD12 wraz z dodatkowymi gatunkami (K367-DD14+B, FE 600 DP, S300EK, P265GH, P275SL, P355NL2, SA516G60-LOWSI, S240 D), na podstawie danych przekazanych przez klienta. Poprawiono czytelność etykiet wersjonowania na liście ofert (numer </w:t>
             </w:r>
             <w:r>
               <w:lastRenderedPageBreak/>
-              <w:t xml:space="preserve">przekazanych przez klienta. Poprawiono czytelność etykiet wersjonowania na liście ofert (numer oferty offer_id/offer_id.N zamieniony miejscami z nazwą oferty jako główny nagłówek wiersza, wyraźniejsza etykieta „poprzednia wersja”). Przycisk „Aktualizuj pozycję” w kalkulatorze zmienia teraz kolor na niebieski podczas edycji istniejącej pozycji, aby odróżnić go od żółtego przycisku dodawania nowej pozycji. Kliknięcie pozycji na liście zestawienia (wiersz lub ołówek) przewija teraz widok automatycznie do góry kalkulatora. Cena bazowa PGL jest od teraz zawsze w EUR (€/t), niezależnie od waluty oferty. Podczas edycji zapisanej oferty w kalkulatorze pojawia się teraz wyraźny baner „Teraz edytujesz ofertę: offer_id”, tak by nie pomylić jej z tworzeniem nowej wyceny; baner pokazuje właściwy numer wersji (np. offer_27.1), nie surowe wewnętrzne ID wiersza w bazie. Tryb wysokiego kontrastu doczekał się osobnych wariantów jasnego i ciemnego (wcześniej był to jeden, stały motyw ignorujący przełącznik jasny/ciemny) - przełączanie między jasnym a ciemnym motywem działa teraz poprawnie również przy włączonym wysokim kontraście, a wyłączenie wysokiego kontrastu przywraca wcześniej wybrany motyw jasny lub ciemny. Poprawiono też kilka miejsc w interfejsie (pasek „Suma Huta”, przyciski przełączające, podpowiedzi gatunków, komunikaty ostrzegawcze), w których kolory tła i tekstu były zapisane na sztywno pod jasny wysoki kontrast i stawały się nieczytelne w wariancie ciemnym. Panel administratora zyskał filtrowanie i sortowanie historii zmian cen bazowych PGL (po typie stali, zakresie dat i dowolnej kolumnie tabeli) wraz z </w:t>
+              <w:t xml:space="preserve">oferty offer_id/offer_id.N zamieniony miejscami z nazwą oferty jako główny nagłówek wiersza, wyraźniejsza etykieta „poprzednia wersja”). Przycisk „Aktualizuj pozycję” w kalkulatorze zmienia teraz kolor na niebieski podczas edycji istniejącej pozycji, aby odróżnić go od żółtego przycisku dodawania nowej pozycji. Kliknięcie pozycji na liście zestawienia (wiersz lub ołówek) przewija teraz widok automatycznie do góry kalkulatora. Cena bazowa PGL jest od teraz zawsze w EUR (€/t), niezależnie od waluty oferty. Podczas edycji zapisanej oferty w kalkulatorze pojawia się teraz wyraźny baner „Teraz edytujesz ofertę: offer_id”, tak by nie pomylić jej z tworzeniem nowej wyceny; baner pokazuje właściwy numer wersji (np. offer_27.1), nie surowe wewnętrzne ID wiersza w bazie. Tryb wysokiego kontrastu doczekał się osobnych wariantów jasnego i ciemnego (wcześniej był to jeden, stały motyw ignorujący przełącznik jasny/ciemny) - przełączanie między jasnym a ciemnym motywem działa teraz poprawnie również przy włączonym wysokim kontraście, a wyłączenie wysokiego kontrastu przywraca wcześniej wybrany motyw jasny lub ciemny. Poprawiono też kilka miejsc w interfejsie (pasek „Suma Huta”, przyciski przełączające, podpowiedzi gatunków, komunikaty ostrzegawcze), w których kolory tła i tekstu były zapisane na sztywno pod jasny wysoki kontrast i stawały się nieczytelne w wariancie ciemnym. Panel administratora zyskał filtrowanie i sortowanie historii zmian cen bazowych PGL (po typie stali, zakresie dat i dowolnej kolumnie tabeli) wraz z przyciskiem czyszczącym filtry; eksport do Excela odzwierciedla teraz aktualnie wybrany widok, a nie zawsze </w:t>
             </w:r>
             <w:r>
               <w:lastRenderedPageBreak/>
-              <w:t>przyciskiem czyszczącym filtry; eksport do Excela odzwierciedla teraz aktualnie wybrany widok, a nie zawsze całą historię. Generowanie oferty PDF respektuje teraz język interfejsu wybrany przez handlowca (PL/EN/CS/DE) - wcześniej cały szablon PDF (nagłówki tabeli, etykiety danych klienta, uwagi prawne w stopce, podpisy) był na sztywno po polsku, niezależnie od języka ustawionego w aplikacji. Na liście „Moje oferty” naprawiono kliknięcie w rozwiniętej historii wersji ofert, które błędnie otwierało do edycji zawsze najnowszą wersję zamiast tej faktycznie klikniętej. W tej samej wersji dodano panel „Analiza” dla wszystkich ról (tonaż zaoferowany, wygrany i przegrany, wskaźnik skuteczności, rozbicie w czasie oraz według typu stali i klienta, tabela ofert z eksportem; zakres danych ustalany po stronie serwera - junior i senior widzą własne oferty, administrator całą firmę) wraz z nową osią „decyzja klienta” na ofercie wysłanej („wygrana” / „przegrana” / „oczekująca”, migracja 018), niezależną od statusu obiegu oferty.</w:t>
+              <w:t>całą historię. Generowanie oferty PDF respektuje teraz język interfejsu wybrany przez handlowca (PL/EN/CS/DE) - wcześniej cały szablon PDF (nagłówki tabeli, etykiety danych klienta, uwagi prawne w stopce, podpisy) był na sztywno po polsku, niezależnie od języka ustawionego w aplikacji. Na liście „Moje oferty” naprawiono kliknięcie w rozwiniętej historii wersji ofert, które błędnie otwierało do edycji zawsze najnowszą wersję zamiast tej faktycznie klikniętej. W tej samej wersji dodano panel „Analiza” dla wszystkich ról (tonaż zaoferowany, wygrany i przegrany, wskaźnik skuteczności, rozbicie w czasie oraz według typu stali i klienta, tabela ofert z eksportem; zakres danych ustalany po stronie serwera - junior i senior widzą własne oferty, administrator całą firmę) wraz z nową osią „decyzja klienta” na ofercie wysłanej („wygrana” / „przegrana” / „oczekująca”, migracja 018), niezależną od statusu obiegu oferty.</w:t>
             </w:r>
           </w:p>
         </w:tc>
@@ -617,11 +621,11 @@
           </w:tcPr>
           <w:p>
             <w:r>
-              <w:t xml:space="preserve">Naprawiono brak synchronizacji kontaktu głównego wpisywanego w panelu „Klienci” z tabelą osób kontaktowych - dane osoby zapisane przy edycji firmy nie pojawiały się w zakładce „Kontakty”. Panel „Klienci” zyskał akcję „Kontakty” przy każdej firmie: rozwija listę zapisanych dla niej osób z możliwością edycji i usunięcia każdej z osobna oraz formularzem dodania kolejnej, bez przechodzenia do osobnej zakładki. Dodano migrację uzupełniającą kontakty zapisane, zanim ta poprawka weszła w życie. Dodano tryb „Wysoki kontrast” (przycisk obok Jasny/Ciemny, dostępny na wszystkich podstronach). W tym samym okresie dodano historię </w:t>
+              <w:t xml:space="preserve">Naprawiono brak synchronizacji kontaktu głównego wpisywanego w panelu „Klienci” z tabelą osób kontaktowych - dane osoby zapisane przy edycji firmy nie pojawiały się w zakładce „Kontakty”. Panel „Klienci” zyskał akcję „Kontakty” przy każdej firmie: rozwija listę zapisanych dla niej osób z możliwością edycji i usunięcia każdej z osobna oraz formularzem dodania kolejnej, bez przechodzenia do osobnej zakładki. Dodano migrację uzupełniającą kontakty zapisane, zanim ta poprawka weszła w życie. Dodano tryb „Wysoki kontrast” (przycisk obok Jasny/Ciemny, dostępny na wszystkich podstronach). W tym samym okresie dodano historię zmian cen bazowych PGL z eksportem do Excela, kolorowe oznaczenia typów stali HRS/CR/HDG w panelu ustawień </w:t>
             </w:r>
             <w:r>
               <w:lastRenderedPageBreak/>
-              <w:t>zmian cen bazowych PGL z eksportem do Excela, kolorowe oznaczenia typów stali HRS/CR/HDG w panelu ustawień oraz klikalne kafelki statusów na pulpicie administratora, a w kalkulatorze kliknięcie wiersza pozycji otwiera ją do edycji. Kolumna „Uwagi” w PDF oferty pokazuje teraz pełny zestaw wybranych dopłat dla każdej pozycji. Panel ustawień administratora zyskał próg „Minimalna marża (%)” - junior może odtąd wysłać ofertę do klienta bezpośrednio z szkicu, bez zatwierdzenia seniora/administratora, jeśli każda pozycja ma marżę i PGL bazowe w normie; w przeciwnym razie oferta nadal wymaga pełnej ścieżki zatwierdzenia. Kliknięcie w ofertę na liście (Moje oferty, Panel seniora, Panel administratora) otwiera ją teraz do edycji, tak jak pozycje w kalkulatorze. Edycja już zapisanej oferty nie nadpisuje jej w miejscu - zapisuje nową wersję („offer_30.1”, „offer_30.2”...), a poprzednie wersje zostają widoczne pod rozwijaną listą na tej samej karcie. W tym samym okresie dodano trzy nowe typy stali obok HRS/CR/HDG: PICKLED (HRS Trawiona), TEARDROP (Blacha łezkowa) i ZM (Magnelis) - wraz z własnymi tabelami gatunków, matrycami dopłat wymiarowych i (dla ZM) matrycą powłoki, w oparciu o dane przekazane przez klienta.</w:t>
+              <w:t>oraz klikalne kafelki statusów na pulpicie administratora, a w kalkulatorze kliknięcie wiersza pozycji otwiera ją do edycji. Kolumna „Uwagi” w PDF oferty pokazuje teraz pełny zestaw wybranych dopłat dla każdej pozycji. Panel ustawień administratora zyskał próg „Minimalna marża (%)” - junior może odtąd wysłać ofertę do klienta bezpośrednio z szkicu, bez zatwierdzenia seniora/administratora, jeśli każda pozycja ma marżę i PGL bazowe w normie; w przeciwnym razie oferta nadal wymaga pełnej ścieżki zatwierdzenia. Kliknięcie w ofertę na liście (Moje oferty, Panel seniora, Panel administratora) otwiera ją teraz do edycji, tak jak pozycje w kalkulatorze. Edycja już zapisanej oferty nie nadpisuje jej w miejscu - zapisuje nową wersję („offer_30.1”, „offer_30.2”...), a poprzednie wersje zostają widoczne pod rozwijaną listą na tej samej karcie. W tym samym okresie dodano trzy nowe typy stali obok HRS/CR/HDG: PICKLED (HRS Trawiona), TEARDROP (Blacha łezkowa) i ZM (Magnelis) - wraz z własnymi tabelami gatunków, matrycami dopłat wymiarowych i (dla ZM) matrycą powłoki, w oparciu o dane przekazane przez klienta.</w:t>
             </w:r>
           </w:p>
         </w:tc>
@@ -664,11 +668,11 @@
           </w:tcPr>
           <w:p>
             <w:r>
-              <w:t xml:space="preserve">Poprawki bezpieczeństwa eksportu PDF: dane oferty i klienta wpisywane przez handlowca są zabezpieczane przed wykonaniem jako kod po stronie usługi generującej dokument, a samo generowanie PDF wymaga jawnie potwierdzonej roli użytkownika. W kalkulatorze dodano ostrzeżenie przy edycji pozycji dodanych przed wersją 1.3, dla których konfiguracja dopłat nie została zapisana i nie da się jej automatycznie odtworzyć. Przebudowano panel </w:t>
+              <w:t xml:space="preserve">Poprawki bezpieczeństwa eksportu PDF: dane oferty i klienta wpisywane przez handlowca są zabezpieczane przed wykonaniem jako kod po stronie usługi generującej dokument, a samo generowanie PDF wymaga jawnie potwierdzonej roli użytkownika. W kalkulatorze dodano ostrzeżenie przy edycji pozycji dodanych przed wersją 1.3, dla których konfiguracja dopłat nie została zapisana i nie da się jej automatycznie odtworzyć. Przebudowano panel danych klienta w kalkulatorze: dane firmy (firma, NIP, adres, SAP ID) zostały oddzielone od danych </w:t>
             </w:r>
             <w:r>
               <w:lastRenderedPageBreak/>
-              <w:t>danych klienta w kalkulatorze: dane firmy (firma, NIP, adres, SAP ID) zostały oddzielone od danych kontaktowych, a pola „Firma” i „NIP” działają jak wyszukiwarki po katalogu klientów. Osoby kontaktowe są od teraz wspólne dla całego działu - jedna firma może mieć ich wiele, a pole imienia podpowiada je od razu po kliknięciu. Naprawiono także brak natychmiastowej widoczności zmian ustawień administratora (PGL bazowe, kurs EUR/PLN) w kalkulatorze bez przeładowania strony, a PGL bazowe skonfigurowano osobno dla typów stali HRS, CR i HDG. Cena końcowa oraz sumy wartości w kalkulatorze, na liście ofert i w PDF są od teraz zaokrąglane w górę do pełnej jednostki waluty - świadoma decyzja biznesowa, żeby nigdy nie zaniżyć ceny wobec klienta.</w:t>
+              <w:t>kontaktowych, a pola „Firma” i „NIP” działają jak wyszukiwarki po katalogu klientów. Osoby kontaktowe są od teraz wspólne dla całego działu - jedna firma może mieć ich wiele, a pole imienia podpowiada je od razu po kliknięciu. Naprawiono także brak natychmiastowej widoczności zmian ustawień administratora (PGL bazowe, kurs EUR/PLN) w kalkulatorze bez przeładowania strony, a PGL bazowe skonfigurowano osobno dla typów stali HRS, CR i HDG. Cena końcowa oraz sumy wartości w kalkulatorze, na liście ofert i w PDF są od teraz zaokrąglane w górę do pełnej jednostki waluty - świadoma decyzja biznesowa, żeby nigdy nie zaniżyć ceny wobec klienta.</w:t>
             </w:r>
           </w:p>
         </w:tc>
@@ -764,11 +768,7 @@
           </w:tcPr>
           <w:p>
             <w:r>
-              <w:t xml:space="preserve">Poprawki regresji po integracji podczas Deployu (m.in. krytyczny błąd edycji pozycji, przywrócona waga arkusza), ujednolicenie generowania PDF na wersję serwerową, zamknięcie </w:t>
-            </w:r>
-            <w:r>
-              <w:lastRenderedPageBreak/>
-              <w:t>rejestracji kont dla administratora oraz eksport ofert do Excela w formacie KTS/GPAO.</w:t>
+              <w:t>Poprawki regresji po integracji podczas Deployu (m.in. krytyczny błąd edycji pozycji, przywrócona waga arkusza), ujednolicenie generowania PDF na wersję serwerową, zamknięcie rejestracji kont dla administratora oraz eksport ofert do Excela w formacie KTS/GPAO.</w:t>
             </w:r>
           </w:p>
         </w:tc>
@@ -969,17 +969,13 @@
           <w:tcPr>
             <w:tcW w:w="1948" w:type="dxa"/>
           </w:tcPr>
-          <w:p>
-            <w:r/>
-          </w:p>
+          <w:p/>
         </w:tc>
         <w:tc>
           <w:tcPr>
             <w:tcW w:w="6908" w:type="dxa"/>
           </w:tcPr>
-          <w:p>
-            <w:r/>
-          </w:p>
+          <w:p/>
         </w:tc>
       </w:tr>
     </w:tbl>
@@ -1056,17 +1052,13 @@
           <w:tcPr>
             <w:tcW w:w="1948" w:type="dxa"/>
           </w:tcPr>
-          <w:p>
-            <w:r/>
-          </w:p>
+          <w:p/>
         </w:tc>
         <w:tc>
           <w:tcPr>
             <w:tcW w:w="6908" w:type="dxa"/>
           </w:tcPr>
-          <w:p>
-            <w:r/>
-          </w:p>
+          <w:p/>
         </w:tc>
       </w:tr>
     </w:tbl>
@@ -1103,8 +1095,8 @@
         <w:tblLook w:val="04A0" w:firstRow="1" w:lastRow="0" w:firstColumn="1" w:lastColumn="0" w:noHBand="0" w:noVBand="1"/>
       </w:tblPr>
       <w:tblGrid>
-        <w:gridCol w:w="1944"/>
-        <w:gridCol w:w="6912"/>
+        <w:gridCol w:w="1948"/>
+        <w:gridCol w:w="6908"/>
       </w:tblGrid>
       <w:tr>
         <w:tc>
@@ -1234,17 +1226,13 @@
           <w:tcPr>
             <w:tcW w:w="1948" w:type="dxa"/>
           </w:tcPr>
-          <w:p>
-            <w:r/>
-          </w:p>
+          <w:p/>
         </w:tc>
         <w:tc>
           <w:tcPr>
             <w:tcW w:w="6908" w:type="dxa"/>
           </w:tcPr>
-          <w:p>
-            <w:r/>
-          </w:p>
+          <w:p/>
         </w:tc>
       </w:tr>
     </w:tbl>
@@ -1281,8 +1269,8 @@
         <w:tblLook w:val="04A0" w:firstRow="1" w:lastRow="0" w:firstColumn="1" w:lastColumn="0" w:noHBand="0" w:noVBand="1"/>
       </w:tblPr>
       <w:tblGrid>
-        <w:gridCol w:w="1963"/>
-        <w:gridCol w:w="6893"/>
+        <w:gridCol w:w="1960"/>
+        <w:gridCol w:w="6896"/>
       </w:tblGrid>
       <w:tr>
         <w:tc>
@@ -1321,17 +1309,13 @@
           <w:tcPr>
             <w:tcW w:w="1948" w:type="dxa"/>
           </w:tcPr>
-          <w:p>
-            <w:r/>
-          </w:p>
+          <w:p/>
         </w:tc>
         <w:tc>
           <w:tcPr>
             <w:tcW w:w="6908" w:type="dxa"/>
           </w:tcPr>
-          <w:p>
-            <w:r/>
-          </w:p>
+          <w:p/>
         </w:tc>
       </w:tr>
     </w:tbl>
@@ -1353,7 +1337,6 @@
         <w:pStyle w:val="Listapunktowana"/>
       </w:pPr>
       <w:r>
-        <w:lastRenderedPageBreak/>
         <w:t>Import ofert z pliku Excel (format KTS/GPAO) - przeanalizowany, budowa świadomie odłożona na później</w:t>
       </w:r>
     </w:p>
@@ -1463,6 +1446,7 @@
         <w:pStyle w:val="Listapunktowana"/>
       </w:pPr>
       <w:r>
+        <w:lastRenderedPageBreak/>
         <w:t>Po otrzymaniu Excela z oddziałami i regionami: zbudowanie struktury organizacyjnej w aplikacji i kierowanie ofert do właściwego kierownika zamiast wspólnej kolejki.</w:t>
       </w:r>
     </w:p>

</xml_diff>

<commit_message>
docs: rebrand 11 offer PDF templates to AM brand policy
Logo top-right in colour with company name (ArcelorMittal), Gilroy font,
AM palette, per Karolina Cisowska's 05.10.2026 notes. Content unchanged.
v2.1 report updated with the change and the follow-up port task.

Co-Authored-By: Claude Opus 5.5 <noreply@anthropic.com>
</commit_message>
<xml_diff>
--- a/Historia wersji oraz md/Historia wersji/AMSteel_Quote_Raport_Wersji_2.1.docx
+++ b/Historia wersji oraz md/Historia wersji/AMSteel_Quote_Raport_Wersji_2.1.docx
@@ -1226,13 +1226,21 @@
           <w:tcPr>
             <w:tcW w:w="1948" w:type="dxa"/>
           </w:tcPr>
-          <w:p/>
+          <w:p>
+            <w:r>
+              <w:t>Zmiana</w:t>
+            </w:r>
+          </w:p>
         </w:tc>
         <w:tc>
           <w:tcPr>
             <w:tcW w:w="6908" w:type="dxa"/>
           </w:tcPr>
-          <w:p/>
+          <w:p>
+            <w:r>
+              <w:t>Nowe szablony oferty PDF zgodne z identyfikacją wizualną ArcelorMittal (uwagi Karoliny Cisowskiej z 05.10.2026): przygotowano 11 wariantów układu (pionowe i poziome, folder „Szablony PDF/Template 1–11”), każdy w dwóch wersjach - oferta 2-pozycyjna oraz 9-pozycyjna. We wszystkich logo ArcelorMittal w kolorze, z nazwą spółki, w prawym górnym rogu, font Gilroy (osadzony w PDF) i kolorystyka AM (pomarańcz #FF3700, grafit #414141, gradient marki). Nazwa spółki to „ArcelorMittal” - narzędzie jest planowane globalnie. Treść oferty bez zmian (te same kolumny, warunki i podpisy); zmienia się tylko wygląd. Szablony wysłane do akceptacji - po wyborze wariantu zostanie on przeniesiony do generatora PDF w aplikacji.</w:t>
+            </w:r>
+          </w:p>
         </w:tc>
       </w:tr>
     </w:tbl>
@@ -1463,6 +1471,9 @@
         <w:spacing w:before="400"/>
         <w:ind w:left="360"/>
       </w:pPr>
+      <w:r>
+        <w:t>Po akceptacji brandingu i wyborze jednego z 11 szablonów PDF: przeniesienie go do generatora PDF w aplikacji (4 języki oferty).</w:t>
+      </w:r>
     </w:p>
     <w:tbl>
       <w:tblPr>

</xml_diff>

<commit_message>
docs: add whole-site branding variants to v2.1 version report
Co-Authored-By: Claude Sonnet 5.5 <noreply@anthropic.com>
</commit_message>
<xml_diff>
--- a/Historia wersji oraz md/Historia wersji/AMSteel_Quote_Raport_Wersji_2.1.docx
+++ b/Historia wersji oraz md/Historia wersji/AMSteel_Quote_Raport_Wersji_2.1.docx
@@ -1317,13 +1317,21 @@
           <w:tcPr>
             <w:tcW w:w="1948" w:type="dxa"/>
           </w:tcPr>
-          <w:p/>
+          <w:p>
+            <w:r>
+              <w:t>Zmiana</w:t>
+            </w:r>
+          </w:p>
         </w:tc>
         <w:tc>
           <w:tcPr>
             <w:tcW w:w="6908" w:type="dxa"/>
           </w:tcPr>
-          <w:p/>
+          <w:p>
+            <w:r>
+              <w:t>Warianty brandingu całej aplikacji zgodne z identyfikacją wizualną ArcelorMittal (kontynuacja uwag Karoliny Cisowskiej z 05.10.2026, tym razem dla całego serwisu, nie tylko PDF): przygotowano 11 wariantów motywu do wyboru (folder „Branding - warianty”) obok obecnego wyglądu (V0): V1 Classic Light i V1 Classic Dark (ciepła biel / ciemny, oficjalne kolory logo, cienki pasek gradientu), V2 Gradient Header (pełny gradient AM w pasku aplikacji), V3 Midnight (ciemny grafit, gradient tylko na przyciskach i aktywnych elementach), V4 Plum Executive (fiolet, nawigacja w formie pigułek), V5 Steel Industrial (grafit i stal, ostre rogi, pomarańczowy akcent), V6 Aurora Light (pastelowy gradient AM za matowymi kartami), V7 Swiss Mono (biel i czerń, kolor marki tylko w logo i przycisku głównym), V8 Ember Dark (prawie czarne tło z gradientem w pasku), V9 Warm Sand (kremowy, ciepły pomarańcz) i V10 Magenta Bold (magentowy pasek nagłówka). Każdy wariant pokazany na czterech ekranach (logowanie, kalkulator, oferty, analityka) w widoku komputerowym i telefonicznym, wraz z zestawieniem zbiorczym (00-przeglad-wszystkich.png) i osobnym plikiem CSS na wariant. We wszystkich logo ArcelorMittal w prawym górnym rogu (wersja kolorowa lub biała, zależnie od tła). Funkcjonalność aplikacji bez zmian - zmienia się wyłącznie wygląd. Warianty wysłane do wyboru przez Łukasza - po decyzji wybrany motyw zostanie wdrożony w aplikacji.</w:t>
+            </w:r>
+          </w:p>
         </w:tc>
       </w:tr>
     </w:tbl>
@@ -1472,7 +1480,7 @@
         <w:ind w:left="360"/>
       </w:pPr>
       <w:r>
-        <w:t>Po akceptacji brandingu i wyborze jednego z 11 szablonów PDF: przeniesienie go do generatora PDF w aplikacji (4 języki oferty).</w:t>
+        <w:t>Po akceptacji brandingu i wyborze jednego z 11 szablonów PDF: przeniesienie go do generatora PDF w aplikacji (4 języki oferty). Po wyborze jednego z 11 wariantów motywu całej strony: wdrożenie go w aplikacji (jasny / ciemny, wysoki kontrast, widok telefonu).</w:t>
       </w:r>
     </w:p>
     <w:tbl>

</xml_diff>

<commit_message>
docs: add offer version change summary to v2.1 version report
Co-Authored-By: Claude Opus 5.5 <noreply@anthropic.com>
</commit_message>
<xml_diff>
--- a/Historia wersji oraz md/Historia wersji/AMSteel_Quote_Raport_Wersji_2.1.docx
+++ b/Historia wersji oraz md/Historia wersji/AMSteel_Quote_Raport_Wersji_2.1.docx
@@ -969,13 +969,21 @@
           <w:tcPr>
             <w:tcW w:w="1948" w:type="dxa"/>
           </w:tcPr>
-          <w:p/>
+          <w:p>
+            <w:r>
+              <w:t>Zmiana</w:t>
+            </w:r>
+          </w:p>
         </w:tc>
         <w:tc>
           <w:tcPr>
             <w:tcW w:w="6908" w:type="dxa"/>
           </w:tcPr>
-          <w:p/>
+          <w:p>
+            <w:r>
+              <w:t>Autor każdej wersji oferty: nowa kolumna offers.created_by (migracja 033_offer_version_author.sql). Zapis nowej oferty, kopii i każdej edycji zapamiętuje, kto ją wykonał - dotąd edycja recenzenta zapisywała się pod właścicielem oferty i autor zmiany ginął. Wersje sprzed migracji nie mają autora. Wdrożenie: migrację 033 uruchomić PRZED wdrożeniem kodu (bez niej listy ofert i zapis zwracają błąd).</w:t>
+            </w:r>
+          </w:p>
         </w:tc>
       </w:tr>
     </w:tbl>
@@ -1148,6 +1156,28 @@
           <w:p>
             <w:r>
               <w:t>Podgląd pozycji oferty w panelu Administratora (Oferty): pod numerem oferty przycisk „📦 N pozycji” rozwija pod wierszem tabelę pozycji (gatunek / wymiary, typ, cena, tonaż, wartość) - tak jak w Moich ofertach i panelu Starszego handlowca. Do wszystkich trzech tabel pozycji (Moje oferty, Starszy handlowiec, Administrator) dodano kolumny PGL (€/t) oraz Marża (€/t i %). Kwoty pokazywane są w walucie i po kursie zapisanym w ofercie; dla starszych pozycji bez zapisanego % marży procent wyliczany jest jak w kalkulatorze: marża / (PGL + dopłaty huty). Trzy dotąd skopiowane tabele zastąpiono jednym wspólnym komponentem.</w:t>
+            </w:r>
+          </w:p>
+        </w:tc>
+      </w:tr>
+      <w:tr>
+        <w:tc>
+          <w:tcPr>
+            <w:tcW w:w="1948" w:type="dxa"/>
+          </w:tcPr>
+          <w:p>
+            <w:r>
+              <w:t>Nowa funkcja</w:t>
+            </w:r>
+          </w:p>
+        </w:tc>
+        <w:tc>
+          <w:tcPr>
+            <w:tcW w:w="6908" w:type="dxa"/>
+          </w:tcPr>
+          <w:p>
+            <w:r>
+              <w:t>Podsumowanie zmian między wersjami oferty (Moje oferty, Oferty w panelu Administratora, Weryfikacja). Przy numerze każdej wersji (offer_X.N) - także najnowszej - krótka etykieta z maks. 3 najważniejszymi zmianami, np. „HDG 2×1250 +5 t, Wartość oferty +6 082 €” (kolejność: pozycje i tonaż &gt; marża &gt; wartość oferty &gt; reszta, pozostałe jako „+N więcej”); pierwsza wersja: „bazowa · N poz. · X t”. Kliknięcie rozwija pełną listę stara → nowa wartość: dodane/usunięte pozycje, tonaż, marża w punktach procentowych, cena końcowa, transport i dopłaty, trasa, termin płatności, ważność, waluta i kurs, dane klienta, nazwa oferty - oraz autora wersji i zdarzenie: edycja, edycja przez recenzenta, renegocjacja po przegranej. Kierunek zmian ceny jest oznaczony kolorem: wzrost marży, ceny końcowej lub wartości oferty - zielona strzałka ▲, spadek - czerwona ▼ (tonaż i warunki bez koloru). Zmiany samego formularza kalkulatora (bez wpływu na ofertę) są pomijane. Przykład: recenzent podnosi marżę 8% → 9,5% (+1,5 pp) przy 15 t i bazie 1 080 €/t (PGL 1 000 + huta 80) - cena końcowa 1 217 → 1 233 €/t (+16 €/t), wartość oferty 18 246 € → 18 489 € (+243 €).</w:t>
             </w:r>
           </w:p>
         </w:tc>

</xml_diff>

<commit_message>
feat: offer validity 24h/48h/custom, payment term from client settings
- Calculator: PaymentTermPicker replaced by QuoteValidityPicker (24h default,
  48h, custom hours, stored as offer_data.quoteValidityHours). Payment term is
  read-only, taken from the client or the global default.
- PDF: "Ważność oferty: Nh" uses the picked hours; payment term reads
  "N dni od otrzymania faktury" (PL/EN/CS/DE). Price validity range unchanged.
- Approval rule quote_validity_hours reads the hours instead of payment
  days x 24 (a 30-day term used to count as 720h); legacy offers keep the
  old derivation via resolveQuoteValidityHours.
- Migration 034: global default payment term 7 -> 30 days. Dropped the
  "2 days" client preset. Simulator takes validity in hours.
- v2.1 version report updated.

Co-Authored-By: Claude Opus 5.5 <noreply@anthropic.com>
</commit_message>
<xml_diff>
--- a/Historia wersji oraz md/Historia wersji/AMSteel_Quote_Raport_Wersji_2.1.docx
+++ b/Historia wersji oraz md/Historia wersji/AMSteel_Quote_Raport_Wersji_2.1.docx
@@ -986,6 +986,28 @@
           </w:p>
         </w:tc>
       </w:tr>
+      <w:tr>
+        <w:tc>
+          <w:tcPr>
+            <w:tcW w:w="1948" w:type="dxa"/>
+          </w:tcPr>
+          <w:p>
+            <w:r>
+              <w:t>Zmiana</w:t>
+            </w:r>
+          </w:p>
+        </w:tc>
+        <w:tc>
+          <w:tcPr>
+            <w:tcW w:w="6908" w:type="dxa"/>
+          </w:tcPr>
+          <w:p>
+            <w:r>
+              <w:t>Domyślny termin płatności zmieniony z 7 na 30 dni (migracja 034_payment_term_default_30.sql - do uruchomienia przy wdrożeniu 2.1, bezpieczna w dowolnej kolejności względem kodu). Usunięto preset „2 dni” z wyboru terminu płatności klienta.</w:t>
+            </w:r>
+          </w:p>
+        </w:tc>
+      </w:tr>
     </w:tbl>
     <w:p>
       <w:pPr>
@@ -1060,13 +1082,21 @@
           <w:tcPr>
             <w:tcW w:w="1948" w:type="dxa"/>
           </w:tcPr>
-          <w:p/>
+          <w:p>
+            <w:r>
+              <w:t>Zmiana</w:t>
+            </w:r>
+          </w:p>
         </w:tc>
         <w:tc>
           <w:tcPr>
             <w:tcW w:w="6908" w:type="dxa"/>
           </w:tcPr>
-          <w:p/>
+          <w:p>
+            <w:r>
+              <w:t>Ważność oferty zamiast terminu płatności w kalkulatorze: w miejscu wyboru terminu płatności są przyciski „Ważność oferty” 24h (domyślnie), 48h oraz Niestandardowy (dowolna liczba godzin). Termin płatności nie jest już wybierany przy ofercie - kalkulator tylko go wyświetla („Termin płatności: 30 dni od otrzymania faktury”) i pobiera z ustawień klienta (panel Klienci / panel Starszego handlowca), a gdy klient nie ma własnego terminu - z domyślnego w Ustawieniach (30 dni). Okres ważności oferty (Ważna od / do) bez zmian. Reguła akceptacji „ważność oferty &gt; 48h” liczona jest teraz z wybranych godzin, a nie z terminu płatności × 24 (wcześniej termin 30 dni dawał 720h i zawsze wymagał akceptacji N+2); zapisane wcześniej oferty zachowują dotychczasowe wyliczenie.</w:t>
+            </w:r>
+          </w:p>
         </w:tc>
       </w:tr>
     </w:tbl>
@@ -1269,6 +1299,28 @@
           <w:p>
             <w:r>
               <w:t>Nowe szablony oferty PDF zgodne z identyfikacją wizualną ArcelorMittal (uwagi Karoliny Cisowskiej z 05.10.2026): przygotowano 11 wariantów układu (pionowe i poziome, folder „Szablony PDF/Template 1–11”), każdy w dwóch wersjach - oferta 2-pozycyjna oraz 9-pozycyjna. We wszystkich logo ArcelorMittal w kolorze, z nazwą spółki, w prawym górnym rogu, font Gilroy (osadzony w PDF) i kolorystyka AM (pomarańcz #FF3700, grafit #414141, gradient marki). Nazwa spółki to „ArcelorMittal” - narzędzie jest planowane globalnie. Treść oferty bez zmian (te same kolumny, warunki i podpisy); zmienia się tylko wygląd. Szablony wysłane do akceptacji - po wyborze wariantu zostanie on przeniesiony do generatora PDF w aplikacji.</w:t>
+            </w:r>
+          </w:p>
+        </w:tc>
+      </w:tr>
+      <w:tr>
+        <w:tc>
+          <w:tcPr>
+            <w:tcW w:w="1948" w:type="dxa"/>
+          </w:tcPr>
+          <w:p>
+            <w:r>
+              <w:t>Zmiana</w:t>
+            </w:r>
+          </w:p>
+        </w:tc>
+        <w:tc>
+          <w:tcPr>
+            <w:tcW w:w="6908" w:type="dxa"/>
+          </w:tcPr>
+          <w:p>
+            <w:r>
+              <w:t>Stopka oferty PDF: „Ważność oferty: 24h / 48h / Nh od daty wystawienia” zgodnie z wyborem w kalkulatorze oraz „Termin płatności: N dni od otrzymania faktury.” z terminu klienta (PL/EN/CS/DE). Linijka okresu ważności oferty (od - do) bez zmian.</w:t>
             </w:r>
           </w:p>
         </w:tc>

</xml_diff>

<commit_message>
docs: add v2.1 summary to version history, plain hyphens instead of dashes
Co-Authored-By: Claude Opus 5.5 <noreply@anthropic.com>
</commit_message>
<xml_diff>
--- a/Historia wersji oraz md/Historia wersji/AMSteel_Quote_Raport_Wersji_2.1.docx
+++ b/Historia wersji oraz md/Historia wersji/AMSteel_Quote_Raport_Wersji_2.1.docx
@@ -286,7 +286,7 @@
           </w:tcPr>
           <w:p>
             <w:r>
-              <w:t>(w trakcie)</w:t>
+              <w:t>Podgląd pozycji oferty w panelu Administratora oraz kolumny PGL i marża (€/t i %) we wszystkich tabelach pozycji. Podsumowanie zmian między wersjami oferty: krótka etykieta z najważniejszymi zmianami przy każdej wersji, po kliknięciu pełna lista stara → nowa wartość z autorem wersji (nowa kolumna offers.created_by, migracja 033). Nowe szablony oferty PDF zgodne z identyfikacją wizualną ArcelorMittal (11 wariantów do wyboru) oraz 11 wariantów brandingu całej aplikacji. Ważność oferty jako przyciski 24h (domyślnie), 48h lub niestandardowa liczba godzin zamiast wyboru terminu płatności; termin płatności pobierany z ustawień klienta (domyślnie 30 dni od otrzymania faktury, migracja 034), okres ważności oferty bez zmian. Reguła akceptacji „ważność oferty &gt; 48h” (Flow 1 N+2, Flow 2 Head of Projects) liczona z wybranych godzin, a nie z terminu płatności.</w:t>
             </w:r>
           </w:p>
         </w:tc>
@@ -403,7 +403,7 @@
               <w:t xml:space="preserve"> </w:t>
             </w:r>
             <w:r>
-              <w:t xml:space="preserve">i naprawiono zawijanie się symbolu waluty w PDF przy bardzo dużych kwotach (powyżej 1 000 000 €). Okres ważności oferty dostał te same gotowe przyciski (Q1–Q4/„Ten miesiąc”/„Niestandardowy”) co termin płatności, z domyślnym okresem i 2-dniowym terminem dla nowej oferty bez klienta; przywrócono też do stopki PDF linijkę o 48-godzinnej ważności oferty, teraz liczoną z wybranego terminu płatności zamiast na sztywno. Naprawiono też analogiczne do walutowego ucinanie bardzo dużych wartości tonażu w PDF. Okres ważności oferty: przyciski Q1–Q4 pokazują teraz tylko kwartały wybranego roku, które jeszcze się nie zakończyły – dla roku bieżącego znikają więc już minione kwartały (np. we wrześniu widoczne są tylko Q3 i Q4), tak by handlowiec nie mógł wystawić nowej oferty z okresem ważności całkowicie w przeszłości; nowo odslonięte kwartały po zmianie na kolejny rok pojawiają się z krótką animacją zamiast skokowo. Panel „Analiza” zyskał zamykalne plakietki aktywnego zawężenia </w:t>
+              <w:t xml:space="preserve">i naprawiono zawijanie się symbolu waluty w PDF przy bardzo dużych kwotach (powyżej 1 000 000 €). Okres ważności oferty dostał te same gotowe przyciski (Q1-Q4/„Ten miesiąc”/„Niestandardowy”) co termin płatności, z domyślnym okresem i 2-dniowym terminem dla nowej oferty bez klienta; przywrócono też do stopki PDF linijkę o 48-godzinnej ważności oferty, teraz liczoną z wybranego terminu płatności zamiast na sztywno. Naprawiono też analogiczne do walutowego ucinanie bardzo dużych wartości tonażu w PDF. Okres ważności oferty: przyciski Q1-Q4 pokazują teraz tylko kwartały wybranego roku, które jeszcze się nie zakończyły - dla roku bieżącego znikają więc już minione kwartały (np. we wrześniu widoczne są tylko Q3 i Q4), tak by handlowiec nie mógł wystawić nowej oferty z okresem ważności całkowicie w przeszłości; nowo odslonięte kwartały po zmianie na kolejny rok pojawiają się z krótką animacją zamiast skokowo. Panel „Analiza” zyskał zamykalne plakietki aktywnego zawężenia </w:t>
             </w:r>
             <w:r>
               <w:lastRenderedPageBreak/>
@@ -465,12 +465,10 @@
               <w:t xml:space="preserve">Dodano opcjonalny komentarz do pozycji z niezerową dopłatą dodatkową w kalkulatorze. Pole komentarza oraz osobny checkbox „Dołącz komentarz do PDF” pojawiają się dopiero po wpisaniu wartości </w:t>
             </w:r>
             <w:r>
-              <w:lastRenderedPageBreak/>
-              <w:t xml:space="preserve">różnej od zera, a treść zapisuje się razem z resztą konfiguracji pozycji (odtwarzana przy edycji, nieusuwana przy chwilowym wyzerowaniu dopłaty). Po zaznaczeniu checkboxa komentarz trafia jako dodatkowy wpis do kolumny „Uwagi” w PDF oferty, we wszystkich miejscach eksportu (kalkulator, Moje oferty, Panel seniora, Panel administratora). Dodano również gatunek jednorazowy - możliwość wyceny gatunku spoza cennika (nazwa + dopłata EUR/t) w obrębie jednej oferty, bez dopisywania go do cennika i bez wpływu na pozostałe oferty. Dodano też opcję odbioru własnego w transporcie - checkbox w panelu „Trasa i transport” ustawia transport na 0 €/t, gdy klient sam odbiera towar spod zakładu. Dodano też harmonogram kwartalny PGL bazowego: administrator planuje ceny na Q1–Q4 wybranego roku osobno dla każdego typu stali, a kalkulator przełącza się na cenę danego kwartału automatycznie z chwilą jego rozpoczęcia. Tabela w panelu administratora pokazuje obok siebie cenę bieżącego miesiąca i wszystkie cztery kwartały. Funkcja wymaga migracji bazy danych (021_create_pgl_quarterly_prices.sql). Poprawiono też zapis ustawień, który przy aktywnej cenie kwartalnej nadpisywał nią ręczną cenę bazową PGL, oraz zaktualizowano dokumentację repozytorium (README, opis „About” na GitHubie, zrzuty ekranu kalkulatora) i numer wersji w nagłówku aplikacji do v1.8. Cały panel kalkulacji zyskał też zwijanie/rozwijanie jednym kliknięciem, analogicznie do panelu Danych Klienta. Ostrzeżenia o PGL poniżej bazy i marży poniżej minimum stały się też wyraźnie widoczne - zamiast drobnego żółtego tekstu </w:t>
+              <w:t xml:space="preserve">różnej od zera, a treść zapisuje się razem z resztą konfiguracji pozycji (odtwarzana przy edycji, nieusuwana przy chwilowym wyzerowaniu dopłaty). Po zaznaczeniu checkboxa komentarz trafia jako dodatkowy wpis do kolumny „Uwagi” w PDF oferty, we wszystkich miejscach eksportu (kalkulator, Moje oferty, Panel seniora, Panel administratora). Dodano również gatunek jednorazowy - możliwość wyceny gatunku spoza cennika (nazwa + dopłata EUR/t) w obrębie jednej oferty, bez dopisywania go do cennika i bez wpływu na pozostałe oferty. Dodano też opcję odbioru własnego w transporcie - checkbox w panelu „Trasa i transport” ustawia transport na 0 €/t, gdy klient sam odbiera towar spod zakładu. Dodano też harmonogram kwartalny PGL bazowego: administrator planuje ceny na Q1-Q4 wybranego roku osobno dla każdego typu stali, a kalkulator przełącza się na cenę danego kwartału automatycznie z chwilą jego rozpoczęcia. Tabela w panelu administratora pokazuje obok siebie cenę bieżącego miesiąca i wszystkie cztery kwartały. Funkcja wymaga migracji bazy danych (021_create_pgl_quarterly_prices.sql). Poprawiono też zapis ustawień, który przy aktywnej cenie kwartalnej nadpisywał nią ręczną cenę bazową PGL, oraz zaktualizowano dokumentację repozytorium (README, opis „About” na GitHubie, zrzuty ekranu kalkulatora) i numer wersji w nagłówku aplikacji do v1.8. Cały panel kalkulacji zyskał też zwijanie/rozwijanie jednym kliknięciem, analogicznie do panelu Danych Klienta. Ostrzeżenia o PGL poniżej bazy i marży poniżej minimum stały się też wyraźnie widoczne - zamiast drobnego żółtego tekstu </w:t>
             </w:r>
             <w:r>
-              <w:lastRenderedPageBreak/>
-              <w:t xml:space="preserve">pokazują się teraz jako czerwono obramowany, pogrubiony komunikat. Złom w podsumowaniu SSC przestał być stałą kwotą 10 €/t - jest teraz % ceny wsadu (domyślnie 2%), konfigurowalny przez administratora w Ustawieniach. Poprawiono też historię zmian cen bazowych PGL, która nie rejestrowała zmian wprowadzanych przez harmonogram kwartalny (edycję ceny bieżącego kwartału) - teraz trafiają do tego samego logu co ręczne zmiany. Dodano też okres ważności oferty: pola „Ważna od”/„Ważna do” obok przełącznika Arkusz/Krąg. Kwartał wyznaczony z daty „Ważna od” automatycznie dobiera PGL bazowe zaplanowane w harmonogramie kwartalnym dla tego okresu, tą samą logiką co dotychczasowe przełączanie na bieżący kwartał - tylko sparametryzowaną wybranym okresem zamiast „teraz”. Gdy zakres „od”–„do” wykracza poza jeden kwartał, PGL nie jest dobierane automatycznie i pojawia się czerwone ostrzeżenie. Wybrany zakres dat trafia też dodatkowo do stopki PDF oferty, obok dotychczasowej formułki o 48-godzinnej ważności oferty. Kwota złomu w podsumowaniu SSC jest teraz zaokrąglana do liczby całkowitej, na polecenie </w:t>
+              <w:t xml:space="preserve">pokazują się teraz jako czerwono obramowany, pogrubiony komunikat. Złom w podsumowaniu SSC przestał być stałą kwotą 10 €/t - jest teraz % ceny wsadu (domyślnie 2%), konfigurowalny przez administratora w Ustawieniach. Poprawiono też historię zmian cen bazowych PGL, która nie rejestrowała zmian wprowadzanych przez harmonogram kwartalny (edycję ceny bieżącego kwartału) - teraz trafiają do tego samego logu co ręczne zmiany. Dodano też okres ważności oferty: pola „Ważna od”/„Ważna do” obok przełącznika Arkusz/Krąg. Kwartał wyznaczony z daty „Ważna od” automatycznie dobiera PGL bazowe zaplanowane w harmonogramie kwartalnym dla tego okresu, tą samą logiką co dotychczasowe przełączanie na bieżący kwartał - tylko sparametryzowaną wybranym okresem zamiast „teraz”. Gdy zakres „od”-„do” wykracza poza jeden kwartał, PGL nie jest dobierane automatycznie i pojawia się czerwone ostrzeżenie. Wybrany zakres dat trafia też dodatkowo do stopki PDF oferty, obok dotychczasowej formułki o 48-godzinnej ważności oferty. Kwota złomu w podsumowaniu SSC jest teraz zaokrąglana do liczby całkowitej, na polecenie </w:t>
             </w:r>
             <w:r>
               <w:t>Łukasza</w:t>
@@ -526,8 +524,7 @@
               <w:t xml:space="preserve">Naprawiono błąd zapisu decyzji klienta (wygrana / przegrana) na ofercie wysłanej - konflikt typów parametru w zapytaniu SQL (kod 42P08); wcześniej funkcja nie zapisywała żadnej decyzji. Zablokowano wysyłkę oferty do klienta bez danych firmy klienta (nazwa firmy i NIP) - tworzenie i zapis oferty bez tych danych nadal działają. Senior może zbudować zespół z juniorów (sekcja „Mój zespół” w panelu seniora i administratora), a panel „Analiza” pokazuje mu wtedy dane własne oraz całego zespołu, z możliwością zawężenia do siebie lub </w:t>
             </w:r>
             <w:r>
-              <w:lastRenderedPageBreak/>
-              <w:t>wybranego juniora. Eksport ofert, panelu „Analiza” i historii PGL do Excela otwiera się teraz z kolumnami dopasowanymi do zawartości, bez ręcznego rozciągania. Dodano automatyczne liczenie transportu z trasy dostawy: rzeczywista odległość drogowa do klienta, cennik przewoźnika w pasmach kilometrowych, przeliczanie na kursy według ładowności 21 t i dopłaty za elementy ponadwymiarowe, wraz z edytowalnym cennikiem w panelu administratora. Wysoki kontrast (jasny i ciemny) przeszedł na nowoczesną paletę kolorów wspólną ze zwykłym motywem – zamiast czerni-na-bieli tryb ten daje teraz większą czcionkę, powiększony widok i grubsze obramowania przy firmowych kolorach. Naprawiono też fałszywe ostrzeżenie o niezapisanych zmianach po rozpoczęciu nowej oferty w trakcie edycji zapisanej – pojawiało się mimo pustego, niezmienionego formularza. Blacha łezkowa otrzymała dopłatę wymiarową zależną od szerokości (30 €/t do 1,5 m, 45 €/t powyżej) oraz własną tabelę gatunków z domyślnym S235JR+N. Wersja 1.7 została wdrożona na środowisko produkcyjne 10.09.2026 wraz z migracjami 019 (zespoły seniora, tabela „team_members”) i 020 (cennik transportowy, tabele „transport_tariff_bands” i „route_cache”); wdrożenie zakończone powodzeniem.</w:t>
+              <w:t>wybranego juniora. Eksport ofert, panelu „Analiza” i historii PGL do Excela otwiera się teraz z kolumnami dopasowanymi do zawartości, bez ręcznego rozciągania. Dodano automatyczne liczenie transportu z trasy dostawy: rzeczywista odległość drogowa do klienta, cennik przewoźnika w pasmach kilometrowych, przeliczanie na kursy według ładowności 21 t i dopłaty za elementy ponadwymiarowe, wraz z edytowalnym cennikiem w panelu administratora. Wysoki kontrast (jasny i ciemny) przeszedł na nowoczesną paletę kolorów wspólną ze zwykłym motywem - zamiast czerni-na-bieli tryb ten daje teraz większą czcionkę, powiększony widok i grubsze obramowania przy firmowych kolorach. Naprawiono też fałszywe ostrzeżenie o niezapisanych zmianach po rozpoczęciu nowej oferty w trakcie edycji zapisanej - pojawiało się mimo pustego, niezmienionego formularza. Blacha łezkowa otrzymała dopłatę wymiarową zależną od szerokości (30 €/t do 1,5 m, 45 €/t powyżej) oraz własną tabelę gatunków z domyślnym S235JR+N. Wersja 1.7 została wdrożona na środowisko produkcyjne 10.09.2026 wraz z migracjami 019 (zespoły seniora, tabela „team_members”) i 020 (cennik transportowy, tabele „transport_tariff_bands” i „route_cache”); wdrożenie zakończone powodzeniem.</w:t>
             </w:r>
           </w:p>
         </w:tc>
@@ -1298,7 +1295,7 @@
           </w:tcPr>
           <w:p>
             <w:r>
-              <w:t>Nowe szablony oferty PDF zgodne z identyfikacją wizualną ArcelorMittal (uwagi Karoliny Cisowskiej z 05.10.2026): przygotowano 11 wariantów układu (pionowe i poziome, folder „Szablony PDF/Template 1–11”), każdy w dwóch wersjach - oferta 2-pozycyjna oraz 9-pozycyjna. We wszystkich logo ArcelorMittal w kolorze, z nazwą spółki, w prawym górnym rogu, font Gilroy (osadzony w PDF) i kolorystyka AM (pomarańcz #FF3700, grafit #414141, gradient marki). Nazwa spółki to „ArcelorMittal” - narzędzie jest planowane globalnie. Treść oferty bez zmian (te same kolumny, warunki i podpisy); zmienia się tylko wygląd. Szablony wysłane do akceptacji - po wyborze wariantu zostanie on przeniesiony do generatora PDF w aplikacji.</w:t>
+              <w:t>Nowe szablony oferty PDF zgodne z identyfikacją wizualną ArcelorMittal (uwagi Karoliny Cisowskiej z 05.10.2026): przygotowano 11 wariantów układu (pionowe i poziome, folder „Szablony PDF/Template 1-11”), każdy w dwóch wersjach - oferta 2-pozycyjna oraz 9-pozycyjna. We wszystkich logo ArcelorMittal w kolorze, z nazwą spółki, w prawym górnym rogu, font Gilroy (osadzony w PDF) i kolorystyka AM (pomarańcz #FF3700, grafit #414141, gradient marki). Nazwa spółki to „ArcelorMittal” - narzędzie jest planowane globalnie. Treść oferty bez zmian (te same kolumny, warunki i podpisy); zmienia się tylko wygląd. Szablony wysłane do akceptacji - po wyborze wariantu zostanie on przeniesiony do generatora PDF w aplikacji.</w:t>
             </w:r>
           </w:p>
         </w:tc>

</xml_diff>

<commit_message>
docs: close v2.1 report and start v2.2 report
Co-Authored-By: Claude Opus 5.5 <noreply@anthropic.com>
</commit_message>
<xml_diff>
--- a/Historia wersji oraz md/Historia wersji/AMSteel_Quote_Raport_Wersji_2.1.docx
+++ b/Historia wersji oraz md/Historia wersji/AMSteel_Quote_Raport_Wersji_2.1.docx
@@ -115,13 +115,7 @@
           </w:tcPr>
           <w:p>
             <w:r>
-              <w:t>1</w:t>
-            </w:r>
-            <w:r>
-              <w:t>3</w:t>
-            </w:r>
-            <w:r>
-              <w:t xml:space="preserve">.10.2026 - </w:t>
+              <w:t>13.10.2026 - 21.10.2026</w:t>
             </w:r>
           </w:p>
         </w:tc>
@@ -145,7 +139,11 @@
           <w:tcPr>
             <w:tcW w:w="5669" w:type="dxa"/>
           </w:tcPr>
-          <w:p/>
+          <w:p>
+            <w:r>
+              <w:t>21.10.2026</w:t>
+            </w:r>
+          </w:p>
         </w:tc>
       </w:tr>
     </w:tbl>
@@ -264,13 +262,7 @@
           </w:tcPr>
           <w:p>
             <w:r>
-              <w:t>1</w:t>
-            </w:r>
-            <w:r>
-              <w:t>3</w:t>
-            </w:r>
-            <w:r>
-              <w:t xml:space="preserve">.10.2026 - </w:t>
+              <w:t>13.10.2026 - 21.10.2026</w:t>
             </w:r>
           </w:p>
         </w:tc>
@@ -278,7 +270,11 @@
           <w:tcPr>
             <w:tcW w:w="1550" w:type="dxa"/>
           </w:tcPr>
-          <w:p/>
+          <w:p>
+            <w:r>
+              <w:t>21.10.2026</w:t>
+            </w:r>
+          </w:p>
         </w:tc>
         <w:tc>
           <w:tcPr>
@@ -337,11 +333,11 @@
           </w:tcPr>
           <w:p>
             <w:r>
-              <w:t xml:space="preserve">Panel Starszego handlowca: rozwijana tabela pozycji z cenami oraz lista pozycji poniżej wytycznych (marża / PGL). Walidacja (zatwierdź / odrzuć) także z poziomu kalkulatora. Powód odrzucenia oferty przez klienta jako lista rozwijana (z opcją „Inne” i własnym tekstem). Statystyki powodów odrzucenia w panelu Analiza. Przebudowa uprawnień: konfigurowalne flowy, role, poziomy hierarchii, reguły walidacji z symulatorem i macierz widoczności (panel „Uprawnienia”). Kafelki statusów w panelu weryfikującego, kolumna PGL i marża % w zestawieniu, skrót do ustawień dla administratora, walidacja spójności pozycji oferty po stronie serwera. Oferty wysłane da się otworzyć w trybie podglądu; ofertę przegraną można renegocjować jako kolejną wersję tej samej oferty, a analityka liczy całą renegocjację jako jedną ofertę (wynik ostatniej rundy). Odpowiedzi biznesu do modelu </w:t>
+              <w:t xml:space="preserve">Panel Starszego handlowca: rozwijana </w:t>
             </w:r>
             <w:r>
               <w:lastRenderedPageBreak/>
-              <w:t>uprawnień wdrożone: Head of Projects zastępuje N+1 i N+2, zastępstwo wyższego poziomu, wysyłka tylko przez twórcę oferty, zatwierdzenie ważne 48 h, reguła marży N+2 = 2,1% lub mniej. Widok piramidy w panelu Handlowcy pokazuje zależności: kto komu podlega i kto jest w czyim zespole. Edytowalny cennik dopłat osobno dla każdego typu stali (panel administratora, historia zmian). Odstęp tysięcy (1 000 000) we wszystkich kwotach i tonażach w aplikacji oraz w PDF. Lista powodów przegranej prowadzona przez administratora (panel „Powody przegranej”, cztery języki, archiwizacja), wybór powodu przy przegranej obowiązkowy.</w:t>
+              <w:t>tabela pozycji z cenami oraz lista pozycji poniżej wytycznych (marża / PGL). Walidacja (zatwierdź / odrzuć) także z poziomu kalkulatora. Powód odrzucenia oferty przez klienta jako lista rozwijana (z opcją „Inne” i własnym tekstem). Statystyki powodów odrzucenia w panelu Analiza. Przebudowa uprawnień: konfigurowalne flowy, role, poziomy hierarchii, reguły walidacji z symulatorem i macierz widoczności (panel „Uprawnienia”). Kafelki statusów w panelu weryfikującego, kolumna PGL i marża % w zestawieniu, skrót do ustawień dla administratora, walidacja spójności pozycji oferty po stronie serwera. Oferty wysłane da się otworzyć w trybie podglądu; ofertę przegraną można renegocjować jako kolejną wersję tej samej oferty, a analityka liczy całą renegocjację jako jedną ofertę (wynik ostatniej rundy). Odpowiedzi biznesu do modelu uprawnień wdrożone: Head of Projects zastępuje N+1 i N+2, zastępstwo wyższego poziomu, wysyłka tylko przez twórcę oferty, zatwierdzenie ważne 48 h, reguła marży N+2 = 2,1% lub mniej. Widok piramidy w panelu Handlowcy pokazuje zależności: kto komu podlega i kto jest w czyim zespole. Edytowalny cennik dopłat osobno dla każdego typu stali (panel administratora, historia zmian). Odstęp tysięcy (1 000 000) we wszystkich kwotach i tonażach w aplikacji oraz w PDF. Lista powodów przegranej prowadzona przez administratora (panel „Powody przegranej”, cztery języki, archiwizacja), wybór powodu przy przegranej obowiązkowy.</w:t>
             </w:r>
           </w:p>
         </w:tc>
@@ -387,11 +383,11 @@
           </w:tcPr>
           <w:p>
             <w:r>
-              <w:t xml:space="preserve">Naprawiono podatność XSS w komunikatach ostrzegawczych kalkulatora o grubości/szerokości poza zakresem tabeli - wartości wstawiane do tych komunikatów (wcześniej bez oczyszczenia, przez dangerouslySetInnerHTML) są teraz oczyszczane (funkcja formatWarning w lib/translations.ts). Na liście „Moje oferty” dodano linię z firmą klienta i numerem SAP bezpośrednio pod numerem oferty, nad nazwą własną oferty, z placeholderem dla ofert bez jeszcze uzupełnionych danych klienta; zmiana obejmuje wszystkie 4 języki interfejsu. Wyszukiwarka i sortowanie na liście ofert rozszerzone o firmę klienta i numer SAP ID (dodatkowo w panelach Starszego handlowca i Administratora pojawiło się sortowanie, którego wcześniej tam w ogóle nie było). Plakietka statusu na liście „Moje oferty” skrócona - powód odrzucenia/przegranej pokazuje się teraz zwięźle obok numeru oferty zamiast w osobnym dużym czerwonym bloku pod nazwą firmy. W Zestawieniu dodano widoczną </w:t>
+              <w:t xml:space="preserve">Naprawiono podatność XSS w komunikatach ostrzegawczych kalkulatora o grubości/szerokości poza zakresem tabeli - wartości wstawiane </w:t>
             </w:r>
             <w:r>
               <w:lastRenderedPageBreak/>
-              <w:t>plakietkę z kosztem transportu pozycji z listy i naprawiono zaniżanie stawki transportu €/t na już dodanych pozycjach, powodowane przez niedodany jeszcze szkic kolejnej pozycji w formularzu kalkulatora. Poprawiono też responsywność całej aplikacji na wąskich ekranach telefonu w orientacji pionowej (ok. 375 px szerokości) - nagłówki i nawigację, kalkulator, listę „Moje oferty”, panele administratora oraz panel Analiza i Starszego handlowca; widok na komputerze i w poziomej orientacji telefonu pozostaje bez zmian. Zamieniono też termin płatności w kalkulatorze i panelu klientów z pary pól dat na przyciski gotowych wartości dni (0/</w:t>
+              <w:t>do tych komunikatów (wcześniej bez oczyszczenia, przez dangerouslySetInnerHTML) są teraz oczyszczane (funkcja formatWarning w lib/translations.ts). Na liście „Moje oferty” dodano linię z firmą klienta i numerem SAP bezpośrednio pod numerem oferty, nad nazwą własną oferty, z placeholderem dla ofert bez jeszcze uzupełnionych danych klienta; zmiana obejmuje wszystkie 4 języki interfejsu. Wyszukiwarka i sortowanie na liście ofert rozszerzone o firmę klienta i numer SAP ID (dodatkowo w panelach Starszego handlowca i Administratora pojawiło się sortowanie, którego wcześniej tam w ogóle nie było). Plakietka statusu na liście „Moje oferty” skrócona - powód odrzucenia/przegranej pokazuje się teraz zwięźle obok numeru oferty zamiast w osobnym dużym czerwonym bloku pod nazwą firmy. W Zestawieniu dodano widoczną plakietkę z kosztem transportu pozycji z listy i naprawiono zaniżanie stawki transportu €/t na już dodanych pozycjach, powodowane przez niedodany jeszcze szkic kolejnej pozycji w formularzu kalkulatora. Poprawiono też responsywność całej aplikacji na wąskich ekranach telefonu w orientacji pionowej (ok. 375 px szerokości) - nagłówki i nawigację, kalkulator, listę „Moje oferty”, panele administratora oraz panel Analiza i Starszego handlowca; widok na komputerze i w poziomej orientacji telefonu pozostaje bez zmian. Zamieniono też termin płatności w kalkulatorze i panelu klientów z pary pól dat na przyciski gotowych wartości dni (0/</w:t>
             </w:r>
             <w:r>
               <w:t>2/</w:t>
@@ -403,11 +399,15 @@
               <w:t xml:space="preserve"> </w:t>
             </w:r>
             <w:r>
-              <w:t xml:space="preserve">i naprawiono zawijanie się symbolu waluty w PDF przy bardzo dużych kwotach (powyżej 1 000 000 €). Okres ważności oferty dostał te same gotowe przyciski (Q1-Q4/„Ten miesiąc”/„Niestandardowy”) co termin płatności, z domyślnym okresem i 2-dniowym terminem dla nowej oferty bez klienta; przywrócono też do stopki PDF linijkę o 48-godzinnej ważności oferty, teraz liczoną z wybranego terminu płatności zamiast na sztywno. Naprawiono też analogiczne do walutowego ucinanie bardzo dużych wartości tonażu w PDF. Okres ważności oferty: przyciski Q1-Q4 pokazują teraz tylko kwartały wybranego roku, które jeszcze się nie zakończyły - dla roku bieżącego znikają więc już minione kwartały (np. we wrześniu widoczne są tylko Q3 i Q4), tak by handlowiec nie mógł wystawić nowej oferty z okresem ważności całkowicie w przeszłości; nowo odslonięte kwartały po zmianie na kolejny rok pojawiają się z krótką animacją zamiast skokowo. Panel „Analiza” zyskał zamykalne plakietki aktywnego zawężenia </w:t>
+              <w:t xml:space="preserve">i naprawiono zawijanie się symbolu waluty w PDF przy bardzo dużych kwotach (powyżej 1 000 000 €). Okres ważności oferty dostał te same gotowe przyciski (Q1-Q4/„Ten </w:t>
             </w:r>
             <w:r>
               <w:lastRenderedPageBreak/>
-              <w:t>(handlowiec/typ stali/status/decyzja klienta/firma) widoczne zarówno w zbiorczym pasku na górze, jak i przy powiązanym panelu oraz eksporcie do Excela. Panel „Handlowcy” administratora dostał zakładki filtrowania po roli z licznikiem kont, a lista ofert administratora pokazuje zamykalną plakietkę handlowca, gdy jest już zawężona do konkretnej osoby. Dodano przycisk „2” w wyborze terminu płatności (kalkulator, panel „Klienci”), tak by domyślny 2-dniowy termin nowej oferty pokazywał się jako gotowy wybór zamiast wartości wpisanej w polu „Inny”. Panel „Handlowcy” w Analizie zyskał też przełącznik filtrujący ranking wyników wg roli (Wszystko/młodszy handlowiec/starszy handlowiec/administrator), z przeliczeniem udziałów procentowych i wiersza „Razem” dla zawężonej grupy. Dodano też w kalkulatorze krótką plakietkę informacyjną przy wyborze okresu ważności oferty na kwartał inny niż bieżący, gdy PGL zaplanowane na ten kwartał różni się od aktualnie obowiązującego, tak by handlowiec od razu widział, że wycena jedzie na innej cenie wsadu. Dodano też podstawową infrastrukturę PWA (manifest, ikony, service worker) z plakietką instalacji aplikacji widoczną wyłącznie na ekranie logowania na telefonach z Androidem, znikającą automatycznie po zalogowaniu. Nagłówek sekcji „Trasa i transport” w Zestawieniu wyróżniono pogrubieniem i kolorem akcentu, żeby było wyraźniej widać, że to klikalny przycisk rozwijający panel.</w:t>
+              <w:t xml:space="preserve">miesiąc”/„Niestandardowy”) co termin płatności, z domyślnym okresem i 2-dniowym terminem dla nowej oferty bez klienta; przywrócono też do stopki PDF linijkę o 48-godzinnej ważności oferty, teraz liczoną z wybranego terminu płatności zamiast na sztywno. Naprawiono też analogiczne do walutowego ucinanie bardzo dużych wartości tonażu w PDF. Okres ważności oferty: przyciski Q1-Q4 pokazują teraz tylko kwartały wybranego roku, które jeszcze się nie zakończyły - dla roku bieżącego znikają więc już minione kwartały (np. we wrześniu widoczne są tylko Q3 i Q4), tak by handlowiec nie mógł wystawić nowej oferty z okresem ważności całkowicie w przeszłości; nowo odslonięte kwartały po zmianie na kolejny rok pojawiają się z krótką animacją zamiast skokowo. Panel „Analiza” zyskał zamykalne plakietki aktywnego zawężenia (handlowiec/typ stali/status/decyzja klienta/firma) widoczne zarówno w zbiorczym pasku na górze, jak i przy powiązanym panelu oraz eksporcie do Excela. Panel „Handlowcy” administratora dostał zakładki filtrowania po roli z licznikiem kont, a lista ofert administratora pokazuje zamykalną plakietkę handlowca, gdy jest już zawężona do konkretnej osoby. Dodano przycisk „2” w wyborze terminu płatności (kalkulator, panel „Klienci”), tak by domyślny 2-dniowy termin nowej oferty pokazywał się jako gotowy wybór zamiast wartości wpisanej w polu „Inny”. Panel „Handlowcy” w Analizie zyskał też przełącznik filtrujący ranking wyników wg roli (Wszystko/młodszy handlowiec/starszy handlowiec/administrator), z przeliczeniem udziałów procentowych i wiersza „Razem” dla zawężonej grupy. Dodano też w kalkulatorze </w:t>
+            </w:r>
+            <w:r>
+              <w:lastRenderedPageBreak/>
+              <w:t>krótką plakietkę informacyjną przy wyborze okresu ważności oferty na kwartał inny niż bieżący, gdy PGL zaplanowane na ten kwartał różni się od aktualnie obowiązującego, tak by handlowiec od razu widział, że wycena jedzie na innej cenie wsadu. Dodano też podstawową infrastrukturę PWA (manifest, ikony, service worker) z plakietką instalacji aplikacji widoczną wyłącznie na ekranie logowania na telefonach z Androidem, znikającą automatycznie po zalogowaniu. Nagłówek sekcji „Trasa i transport” w Zestawieniu wyróżniono pogrubieniem i kolorem akcentu, żeby było wyraźniej widać, że to klikalny przycisk rozwijający panel.</w:t>
             </w:r>
           </w:p>
         </w:tc>
@@ -462,23 +462,25 @@
           </w:tcPr>
           <w:p>
             <w:r>
-              <w:t xml:space="preserve">Dodano opcjonalny komentarz do pozycji z niezerową dopłatą dodatkową w kalkulatorze. Pole komentarza oraz osobny checkbox „Dołącz komentarz do PDF” pojawiają się dopiero po wpisaniu wartości </w:t>
+              <w:t xml:space="preserve">Dodano opcjonalny komentarz do pozycji z niezerową dopłatą dodatkową w kalkulatorze. Pole komentarza oraz osobny checkbox „Dołącz komentarz do PDF” pojawiają się dopiero po wpisaniu wartości różnej od zera, a treść zapisuje się razem z resztą konfiguracji pozycji (odtwarzana przy edycji, nieusuwana przy chwilowym wyzerowaniu dopłaty). Po zaznaczeniu checkboxa komentarz trafia jako dodatkowy wpis do kolumny „Uwagi” w PDF oferty, we wszystkich miejscach eksportu (kalkulator, Moje oferty, Panel seniora, Panel administratora). Dodano również gatunek jednorazowy - możliwość wyceny gatunku spoza cennika (nazwa + dopłata EUR/t) w obrębie jednej oferty, bez dopisywania go do cennika i bez wpływu na pozostałe oferty. Dodano też opcję odbioru własnego w transporcie - checkbox w panelu „Trasa i transport” ustawia transport na 0 €/t, gdy klient sam odbiera towar spod zakładu. Dodano też harmonogram kwartalny PGL bazowego: administrator planuje ceny na Q1-Q4 wybranego roku osobno dla </w:t>
             </w:r>
             <w:r>
-              <w:t xml:space="preserve">różnej od zera, a treść zapisuje się razem z resztą konfiguracji pozycji (odtwarzana przy edycji, nieusuwana przy chwilowym wyzerowaniu dopłaty). Po zaznaczeniu checkboxa komentarz trafia jako dodatkowy wpis do kolumny „Uwagi” w PDF oferty, we wszystkich miejscach eksportu (kalkulator, Moje oferty, Panel seniora, Panel administratora). Dodano również gatunek jednorazowy - możliwość wyceny gatunku spoza cennika (nazwa + dopłata EUR/t) w obrębie jednej oferty, bez dopisywania go do cennika i bez wpływu na pozostałe oferty. Dodano też opcję odbioru własnego w transporcie - checkbox w panelu „Trasa i transport” ustawia transport na 0 €/t, gdy klient sam odbiera towar spod zakładu. Dodano też harmonogram kwartalny PGL bazowego: administrator planuje ceny na Q1-Q4 wybranego roku osobno dla każdego typu stali, a kalkulator przełącza się na cenę danego kwartału automatycznie z chwilą jego rozpoczęcia. Tabela w panelu administratora pokazuje obok siebie cenę bieżącego miesiąca i wszystkie cztery kwartały. Funkcja wymaga migracji bazy danych (021_create_pgl_quarterly_prices.sql). Poprawiono też zapis ustawień, który przy aktywnej cenie kwartalnej nadpisywał nią ręczną cenę bazową PGL, oraz zaktualizowano dokumentację repozytorium (README, opis „About” na GitHubie, zrzuty ekranu kalkulatora) i numer wersji w nagłówku aplikacji do v1.8. Cały panel kalkulacji zyskał też zwijanie/rozwijanie jednym kliknięciem, analogicznie do panelu Danych Klienta. Ostrzeżenia o PGL poniżej bazy i marży poniżej minimum stały się też wyraźnie widoczne - zamiast drobnego żółtego tekstu </w:t>
+              <w:lastRenderedPageBreak/>
+              <w:t xml:space="preserve">każdego typu stali, a kalkulator przełącza się na cenę danego kwartału automatycznie z chwilą jego rozpoczęcia. Tabela w panelu administratora pokazuje obok siebie cenę bieżącego miesiąca i wszystkie cztery kwartały. Funkcja wymaga migracji bazy danych (021_create_pgl_quarterly_prices.sql). Poprawiono też zapis ustawień, który przy aktywnej cenie kwartalnej nadpisywał nią ręczną cenę bazową PGL, oraz zaktualizowano dokumentację repozytorium (README, opis „About” na GitHubie, zrzuty ekranu kalkulatora) i numer wersji w nagłówku aplikacji do v1.8. Cały panel kalkulacji zyskał też zwijanie/rozwijanie jednym kliknięciem, analogicznie do panelu Danych Klienta. Ostrzeżenia o PGL poniżej bazy i marży poniżej minimum stały się też wyraźnie widoczne - zamiast drobnego żółtego tekstu pokazują się teraz jako czerwono obramowany, pogrubiony komunikat. Złom w podsumowaniu SSC przestał być stałą kwotą 10 €/t - jest teraz % ceny wsadu (domyślnie 2%), konfigurowalny przez administratora w Ustawieniach. Poprawiono też historię zmian cen bazowych PGL, która nie rejestrowała zmian wprowadzanych przez harmonogram kwartalny (edycję ceny bieżącego kwartału) - teraz trafiają do tego samego logu co ręczne zmiany. Dodano też okres ważności oferty: pola „Ważna od”/„Ważna do” obok przełącznika Arkusz/Krąg. Kwartał wyznaczony z daty „Ważna od” automatycznie dobiera PGL bazowe zaplanowane w harmonogramie kwartalnym dla tego okresu, tą samą logiką co dotychczasowe przełączanie na bieżący kwartał - tylko sparametryzowaną wybranym okresem zamiast „teraz”. Gdy zakres </w:t>
             </w:r>
             <w:r>
-              <w:t xml:space="preserve">pokazują się teraz jako czerwono obramowany, pogrubiony komunikat. Złom w podsumowaniu SSC przestał być stałą kwotą 10 €/t - jest teraz % ceny wsadu (domyślnie 2%), konfigurowalny przez administratora w Ustawieniach. Poprawiono też historię zmian cen bazowych PGL, która nie rejestrowała zmian wprowadzanych przez harmonogram kwartalny (edycję ceny bieżącego kwartału) - teraz trafiają do tego samego logu co ręczne zmiany. Dodano też okres ważności oferty: pola „Ważna od”/„Ważna do” obok przełącznika Arkusz/Krąg. Kwartał wyznaczony z daty „Ważna od” automatycznie dobiera PGL bazowe zaplanowane w harmonogramie kwartalnym dla tego okresu, tą samą logiką co dotychczasowe przełączanie na bieżący kwartał - tylko sparametryzowaną wybranym okresem zamiast „teraz”. Gdy zakres „od”-„do” wykracza poza jeden kwartał, PGL nie jest dobierane automatycznie i pojawia się czerwone ostrzeżenie. Wybrany zakres dat trafia też dodatkowo do stopki PDF oferty, obok dotychczasowej formułki o 48-godzinnej ważności oferty. Kwota złomu w podsumowaniu SSC jest teraz zaokrąglana do liczby całkowitej, na polecenie </w:t>
+              <w:lastRenderedPageBreak/>
+              <w:t xml:space="preserve">„od”-„do” wykracza poza jeden kwartał, PGL nie jest dobierane automatycznie i pojawia się czerwone ostrzeżenie. Wybrany zakres dat trafia też dodatkowo do stopki PDF oferty, obok dotychczasowej formułki o 48-godzinnej ważności oferty. Kwota złomu w podsumowaniu SSC jest teraz zaokrąglana do liczby całkowitej, na polecenie </w:t>
             </w:r>
             <w:r>
               <w:t>Łukasza</w:t>
             </w:r>
             <w:r>
-              <w:t xml:space="preserve">. Dodano też termin płatności: osobna para pól „od”/„do” obok okresu ważności oferty, gdzie „do” domyślnie dolicza się jako „od” + termin klienta (konfigurowalny w panelu Klienci, dostępnym też dla starszego handlowca) albo globalny domyślny z Ustawień (domyślnie 7 dni), z możliwością ręcznej zmiany; ustawiony termin trafia też do stopki PDF, zastępując ogólną formułkę o warunkach płatności. Poprawiono też PDF oferty: podsumowanie sumy przestało powtarzać się po każdej stronie tabeli pozycji (pokazuje się </w:t>
+              <w:t xml:space="preserve">. Dodano też termin płatności: osobna para pól „od”/„do” obok okresu ważności oferty, gdzie „do” domyślnie dolicza się jako „od” + termin klienta (konfigurowalny w panelu Klienci, dostępnym też dla starszego handlowca) albo globalny domyślny z Ustawień (domyślnie 7 dni), z możliwością ręcznej zmiany; ustawiony termin trafia też do stopki PDF, zastępując ogólną formułkę o warunkach płatności. Poprawiono też PDF oferty: podsumowanie sumy przestało powtarzać się po każdej stronie tabeli pozycji (pokazuje się teraz raz, po ostatniej pozycji), a tekst w kolumnach „Cena”/„Wartość” przestał się rozjeżdżać przy pięciocyfrowych kwotach. W zestawieniu pozycji doszła możliwość zmiany kolejności wierszy przeciąganiem za uchwyt, z automatycznym przeliczeniem numeracji „Lp.” i płynną animacją przesuwania pozostałych pozycji - nowa kolejność obowiązuje też w PDF, Excelu i zapisanej ofercie; funkcja działa również dotykiem na telefonie i tablecie, nie tylko myszką. Podsumowanie zestawienia pozycji pokazuje teraz również łączną liczbę ton, wyrównaną w wierszu podsumowującym dokładnie pod kolumnami „Tony” i „Wartość” tabeli. Dodano też migrację przeterminowanego PGL: otwarcie do edycji zapisanej oferty (albo świeżo zduplikowanej kopii) wycenionej w innym kwartale niż bieżący </w:t>
             </w:r>
             <w:r>
               <w:lastRenderedPageBreak/>
-              <w:t>teraz raz, po ostatniej pozycji), a tekst w kolumnach „Cena”/„Wartość” przestał się rozjeżdżać przy pięciocyfrowych kwotach. W zestawieniu pozycji doszła możliwość zmiany kolejności wierszy przeciąganiem za uchwyt, z automatycznym przeliczeniem numeracji „Lp.” i płynną animacją przesuwania pozostałych pozycji - nowa kolejność obowiązuje też w PDF, Excelu i zapisanej ofercie; funkcja działa również dotykiem na telefonie i tablecie, nie tylko myszką. Podsumowanie zestawienia pozycji pokazuje teraz również łączną liczbę ton, wyrównaną w wierszu podsumowującym dokładnie pod kolumnami „Tony” i „Wartość” tabeli. Dodano też migrację przeterminowanego PGL: otwarcie do edycji zapisanej oferty (albo świeżo zduplikowanej kopii) wycenionej w innym kwartale niż bieżący automatycznie aktualizuje PGL bazowe, PGL/marżę/cenę każdej pozycji zestawienia oraz okres ważności do dzisiejszej daty, z wyraźnym banerem informującym o zmianie i liczbie przeliczonych pozycji; nic nie zapisuje się do bazy bez ręcznego zapisania oferty.</w:t>
+              <w:t>automatycznie aktualizuje PGL bazowe, PGL/marżę/cenę każdej pozycji zestawienia oraz okres ważności do dzisiejszej daty, z wyraźnym banerem informującym o zmianie i liczbie przeliczonych pozycji; nic nie zapisuje się do bazy bez ręcznego zapisania oferty.</w:t>
             </w:r>
           </w:p>
         </w:tc>
@@ -521,10 +523,11 @@
           </w:tcPr>
           <w:p>
             <w:r>
-              <w:t xml:space="preserve">Naprawiono błąd zapisu decyzji klienta (wygrana / przegrana) na ofercie wysłanej - konflikt typów parametru w zapytaniu SQL (kod 42P08); wcześniej funkcja nie zapisywała żadnej decyzji. Zablokowano wysyłkę oferty do klienta bez danych firmy klienta (nazwa firmy i NIP) - tworzenie i zapis oferty bez tych danych nadal działają. Senior może zbudować zespół z juniorów (sekcja „Mój zespół” w panelu seniora i administratora), a panel „Analiza” pokazuje mu wtedy dane własne oraz całego zespołu, z możliwością zawężenia do siebie lub </w:t>
+              <w:t xml:space="preserve">Naprawiono błąd zapisu decyzji klienta (wygrana / przegrana) na ofercie wysłanej - konflikt typów parametru w zapytaniu SQL (kod 42P08); wcześniej funkcja nie zapisywała żadnej decyzji. Zablokowano wysyłkę oferty do klienta bez danych firmy klienta (nazwa firmy i NIP) - tworzenie i zapis oferty bez tych danych nadal działają. Senior może zbudować zespół z juniorów (sekcja „Mój zespół” w panelu seniora i administratora), a panel „Analiza” pokazuje mu wtedy dane własne oraz całego zespołu, z możliwością zawężenia do siebie lub wybranego juniora. Eksport ofert, panelu „Analiza” i historii PGL do Excela otwiera się teraz z kolumnami dopasowanymi do zawartości, bez ręcznego rozciągania. Dodano automatyczne liczenie transportu z trasy dostawy: rzeczywista odległość drogowa do klienta, cennik przewoźnika w pasmach kilometrowych, przeliczanie na kursy według ładowności 21 t i dopłaty za elementy ponadwymiarowe, wraz z edytowalnym cennikiem w panelu administratora. Wysoki kontrast (jasny i ciemny) przeszedł na nowoczesną paletę kolorów wspólną ze zwykłym motywem - zamiast czerni-na-bieli tryb ten daje teraz większą czcionkę, powiększony widok i grubsze obramowania przy firmowych kolorach. Naprawiono też fałszywe ostrzeżenie o niezapisanych zmianach po rozpoczęciu nowej oferty w trakcie edycji zapisanej - pojawiało się mimo </w:t>
             </w:r>
             <w:r>
-              <w:t>wybranego juniora. Eksport ofert, panelu „Analiza” i historii PGL do Excela otwiera się teraz z kolumnami dopasowanymi do zawartości, bez ręcznego rozciągania. Dodano automatyczne liczenie transportu z trasy dostawy: rzeczywista odległość drogowa do klienta, cennik przewoźnika w pasmach kilometrowych, przeliczanie na kursy według ładowności 21 t i dopłaty za elementy ponadwymiarowe, wraz z edytowalnym cennikiem w panelu administratora. Wysoki kontrast (jasny i ciemny) przeszedł na nowoczesną paletę kolorów wspólną ze zwykłym motywem - zamiast czerni-na-bieli tryb ten daje teraz większą czcionkę, powiększony widok i grubsze obramowania przy firmowych kolorach. Naprawiono też fałszywe ostrzeżenie o niezapisanych zmianach po rozpoczęciu nowej oferty w trakcie edycji zapisanej - pojawiało się mimo pustego, niezmienionego formularza. Blacha łezkowa otrzymała dopłatę wymiarową zależną od szerokości (30 €/t do 1,5 m, 45 €/t powyżej) oraz własną tabelę gatunków z domyślnym S235JR+N. Wersja 1.7 została wdrożona na środowisko produkcyjne 10.09.2026 wraz z migracjami 019 (zespoły seniora, tabela „team_members”) i 020 (cennik transportowy, tabele „transport_tariff_bands” i „route_cache”); wdrożenie zakończone powodzeniem.</w:t>
+              <w:lastRenderedPageBreak/>
+              <w:t>pustego, niezmienionego formularza. Blacha łezkowa otrzymała dopłatę wymiarową zależną od szerokości (30 €/t do 1,5 m, 45 €/t powyżej) oraz własną tabelę gatunków z domyślnym S235JR+N. Wersja 1.7 została wdrożona na środowisko produkcyjne 10.09.2026 wraz z migracjami 019 (zespoły seniora, tabela „team_members”) i 020 (cennik transportowy, tabele „transport_tariff_bands” i „route_cache”); wdrożenie zakończone powodzeniem.</w:t>
             </w:r>
           </w:p>
         </w:tc>
@@ -567,15 +570,15 @@
           </w:tcPr>
           <w:p>
             <w:r>
-              <w:t xml:space="preserve">Uzupełniono tabelę gatunków PICKLED (HRS Trawiona) o brakujący zakres SAPH 440 -&gt; DD12 wraz z dodatkowymi gatunkami (K367-DD14+B, FE 600 DP, S300EK, P265GH, P275SL, P355NL2, SA516G60-LOWSI, S240 D), na podstawie danych przekazanych przez klienta. Poprawiono czytelność etykiet wersjonowania na liście ofert (numer </w:t>
+              <w:t xml:space="preserve">Uzupełniono tabelę gatunków PICKLED (HRS Trawiona) o brakujący zakres SAPH 440 -&gt; DD12 wraz z dodatkowymi gatunkami (K367-DD14+B, FE 600 DP, S300EK, P265GH, P275SL, P355NL2, SA516G60-LOWSI, S240 D), na podstawie danych przekazanych przez klienta. Poprawiono czytelność etykiet wersjonowania na liście ofert (numer oferty offer_id/offer_id.N zamieniony miejscami z nazwą oferty jako główny nagłówek wiersza, wyraźniejsza etykieta „poprzednia wersja”). Przycisk „Aktualizuj pozycję” w kalkulatorze zmienia teraz kolor na niebieski podczas edycji istniejącej pozycji, aby odróżnić go od żółtego przycisku dodawania nowej pozycji. Kliknięcie pozycji na liście zestawienia (wiersz lub ołówek) przewija teraz widok automatycznie do góry kalkulatora. Cena bazowa PGL jest od teraz zawsze w EUR (€/t), niezależnie od waluty oferty. Podczas edycji zapisanej oferty w kalkulatorze pojawia się teraz wyraźny baner „Teraz edytujesz ofertę: offer_id”, tak by nie pomylić jej z tworzeniem nowej wyceny; baner pokazuje właściwy numer wersji (np. offer_27.1), nie surowe wewnętrzne ID wiersza w bazie. Tryb wysokiego kontrastu doczekał się osobnych wariantów </w:t>
             </w:r>
             <w:r>
               <w:lastRenderedPageBreak/>
-              <w:t xml:space="preserve">oferty offer_id/offer_id.N zamieniony miejscami z nazwą oferty jako główny nagłówek wiersza, wyraźniejsza etykieta „poprzednia wersja”). Przycisk „Aktualizuj pozycję” w kalkulatorze zmienia teraz kolor na niebieski podczas edycji istniejącej pozycji, aby odróżnić go od żółtego przycisku dodawania nowej pozycji. Kliknięcie pozycji na liście zestawienia (wiersz lub ołówek) przewija teraz widok automatycznie do góry kalkulatora. Cena bazowa PGL jest od teraz zawsze w EUR (€/t), niezależnie od waluty oferty. Podczas edycji zapisanej oferty w kalkulatorze pojawia się teraz wyraźny baner „Teraz edytujesz ofertę: offer_id”, tak by nie pomylić jej z tworzeniem nowej wyceny; baner pokazuje właściwy numer wersji (np. offer_27.1), nie surowe wewnętrzne ID wiersza w bazie. Tryb wysokiego kontrastu doczekał się osobnych wariantów jasnego i ciemnego (wcześniej był to jeden, stały motyw ignorujący przełącznik jasny/ciemny) - przełączanie między jasnym a ciemnym motywem działa teraz poprawnie również przy włączonym wysokim kontraście, a wyłączenie wysokiego kontrastu przywraca wcześniej wybrany motyw jasny lub ciemny. Poprawiono też kilka miejsc w interfejsie (pasek „Suma Huta”, przyciski przełączające, podpowiedzi gatunków, komunikaty ostrzegawcze), w których kolory tła i tekstu były zapisane na sztywno pod jasny wysoki kontrast i stawały się nieczytelne w wariancie ciemnym. Panel administratora zyskał filtrowanie i sortowanie historii zmian cen bazowych PGL (po typie stali, zakresie dat i dowolnej kolumnie tabeli) wraz z przyciskiem czyszczącym filtry; eksport do Excela odzwierciedla teraz aktualnie wybrany widok, a nie zawsze </w:t>
+              <w:t xml:space="preserve">jasnego i ciemnego (wcześniej był to jeden, stały motyw ignorujący przełącznik jasny/ciemny) - przełączanie między jasnym a ciemnym motywem działa teraz poprawnie również przy włączonym wysokim kontraście, a wyłączenie wysokiego kontrastu przywraca wcześniej wybrany motyw jasny lub ciemny. Poprawiono też kilka miejsc w interfejsie (pasek „Suma Huta”, przyciski przełączające, podpowiedzi gatunków, komunikaty ostrzegawcze), w których kolory tła i tekstu były zapisane na sztywno pod jasny wysoki kontrast i stawały się nieczytelne w wariancie ciemnym. Panel administratora zyskał filtrowanie i sortowanie historii zmian cen bazowych PGL (po typie stali, zakresie dat i dowolnej kolumnie tabeli) wraz z przyciskiem czyszczącym filtry; eksport do Excela odzwierciedla teraz aktualnie wybrany widok, a nie zawsze całą historię. Generowanie oferty PDF respektuje teraz język interfejsu wybrany przez handlowca (PL/EN/CS/DE) - wcześniej cały szablon PDF (nagłówki tabeli, etykiety danych klienta, uwagi prawne w stopce, podpisy) był na sztywno po polsku, niezależnie od języka ustawionego w aplikacji. Na liście „Moje oferty” naprawiono kliknięcie w rozwiniętej historii wersji ofert, które błędnie otwierało do edycji zawsze najnowszą wersję zamiast tej faktycznie klikniętej. W tej samej wersji dodano panel „Analiza” dla wszystkich ról (tonaż zaoferowany, wygrany i przegrany, wskaźnik skuteczności, rozbicie w czasie oraz według typu stali i klienta, tabela ofert z eksportem; zakres danych ustalany po stronie serwera - junior i senior widzą własne oferty, administrator całą firmę) wraz z nową osią „decyzja klienta” na ofercie wysłanej </w:t>
             </w:r>
             <w:r>
               <w:lastRenderedPageBreak/>
-              <w:t>całą historię. Generowanie oferty PDF respektuje teraz język interfejsu wybrany przez handlowca (PL/EN/CS/DE) - wcześniej cały szablon PDF (nagłówki tabeli, etykiety danych klienta, uwagi prawne w stopce, podpisy) był na sztywno po polsku, niezależnie od języka ustawionego w aplikacji. Na liście „Moje oferty” naprawiono kliknięcie w rozwiniętej historii wersji ofert, które błędnie otwierało do edycji zawsze najnowszą wersję zamiast tej faktycznie klikniętej. W tej samej wersji dodano panel „Analiza” dla wszystkich ról (tonaż zaoferowany, wygrany i przegrany, wskaźnik skuteczności, rozbicie w czasie oraz według typu stali i klienta, tabela ofert z eksportem; zakres danych ustalany po stronie serwera - junior i senior widzą własne oferty, administrator całą firmę) wraz z nową osią „decyzja klienta” na ofercie wysłanej („wygrana” / „przegrana” / „oczekująca”, migracja 018), niezależną od statusu obiegu oferty.</w:t>
+              <w:t>(„wygrana” / „przegrana” / „oczekująca”, migracja 018), niezależną od statusu obiegu oferty.</w:t>
             </w:r>
           </w:p>
         </w:tc>
@@ -618,11 +621,11 @@
           </w:tcPr>
           <w:p>
             <w:r>
-              <w:t xml:space="preserve">Naprawiono brak synchronizacji kontaktu głównego wpisywanego w panelu „Klienci” z tabelą osób kontaktowych - dane osoby zapisane przy edycji firmy nie pojawiały się w zakładce „Kontakty”. Panel „Klienci” zyskał akcję „Kontakty” przy każdej firmie: rozwija listę zapisanych dla niej osób z możliwością edycji i usunięcia każdej z osobna oraz formularzem dodania kolejnej, bez przechodzenia do osobnej zakładki. Dodano migrację uzupełniającą kontakty zapisane, zanim ta poprawka weszła w życie. Dodano tryb „Wysoki kontrast” (przycisk obok Jasny/Ciemny, dostępny na wszystkich podstronach). W tym samym okresie dodano historię zmian cen bazowych PGL z eksportem do Excela, kolorowe oznaczenia typów stali HRS/CR/HDG w panelu ustawień </w:t>
+              <w:t xml:space="preserve">Naprawiono brak synchronizacji kontaktu głównego wpisywanego w panelu „Klienci” z tabelą osób kontaktowych - dane osoby zapisane przy edycji firmy nie pojawiały się w zakładce „Kontakty”. Panel „Klienci” zyskał akcję „Kontakty” przy każdej firmie: rozwija listę zapisanych dla niej osób z możliwością edycji i usunięcia każdej z osobna oraz formularzem dodania kolejnej, bez przechodzenia do osobnej zakładki. Dodano migrację uzupełniającą kontakty zapisane, zanim ta poprawka weszła w życie. Dodano tryb „Wysoki kontrast” (przycisk obok Jasny/Ciemny, dostępny na wszystkich podstronach). W tym samym okresie dodano historię zmian cen bazowych PGL z eksportem do Excela, kolorowe oznaczenia typów stali HRS/CR/HDG w panelu ustawień oraz klikalne kafelki statusów na pulpicie administratora, a w kalkulatorze kliknięcie wiersza pozycji otwiera ją do edycji. Kolumna „Uwagi” w PDF oferty pokazuje teraz pełny zestaw wybranych dopłat dla każdej pozycji. Panel ustawień administratora zyskał próg „Minimalna marża (%)” - junior może odtąd wysłać ofertę do klienta bezpośrednio z szkicu, bez zatwierdzenia seniora/administratora, jeśli każda pozycja ma marżę i PGL bazowe w normie; w przeciwnym razie oferta nadal wymaga pełnej ścieżki zatwierdzenia. Kliknięcie w ofertę na liście (Moje oferty, Panel seniora, Panel administratora) otwiera ją teraz do edycji, tak jak pozycje w kalkulatorze. Edycja już zapisanej oferty nie nadpisuje jej w miejscu - zapisuje nową wersję („offer_30.1”, „offer_30.2”...), a poprzednie wersje zostają widoczne pod rozwijaną listą na tej samej karcie. W tym samym </w:t>
             </w:r>
             <w:r>
               <w:lastRenderedPageBreak/>
-              <w:t>oraz klikalne kafelki statusów na pulpicie administratora, a w kalkulatorze kliknięcie wiersza pozycji otwiera ją do edycji. Kolumna „Uwagi” w PDF oferty pokazuje teraz pełny zestaw wybranych dopłat dla każdej pozycji. Panel ustawień administratora zyskał próg „Minimalna marża (%)” - junior może odtąd wysłać ofertę do klienta bezpośrednio z szkicu, bez zatwierdzenia seniora/administratora, jeśli każda pozycja ma marżę i PGL bazowe w normie; w przeciwnym razie oferta nadal wymaga pełnej ścieżki zatwierdzenia. Kliknięcie w ofertę na liście (Moje oferty, Panel seniora, Panel administratora) otwiera ją teraz do edycji, tak jak pozycje w kalkulatorze. Edycja już zapisanej oferty nie nadpisuje jej w miejscu - zapisuje nową wersję („offer_30.1”, „offer_30.2”...), a poprzednie wersje zostają widoczne pod rozwijaną listą na tej samej karcie. W tym samym okresie dodano trzy nowe typy stali obok HRS/CR/HDG: PICKLED (HRS Trawiona), TEARDROP (Blacha łezkowa) i ZM (Magnelis) - wraz z własnymi tabelami gatunków, matrycami dopłat wymiarowych i (dla ZM) matrycą powłoki, w oparciu o dane przekazane przez klienta.</w:t>
+              <w:t>okresie dodano trzy nowe typy stali obok HRS/CR/HDG: PICKLED (HRS Trawiona), TEARDROP (Blacha łezkowa) i ZM (Magnelis) - wraz z własnymi tabelami gatunków, matrycami dopłat wymiarowych i (dla ZM) matrycą powłoki, w oparciu o dane przekazane przez klienta.</w:t>
             </w:r>
           </w:p>
         </w:tc>
@@ -665,11 +668,7 @@
           </w:tcPr>
           <w:p>
             <w:r>
-              <w:t xml:space="preserve">Poprawki bezpieczeństwa eksportu PDF: dane oferty i klienta wpisywane przez handlowca są zabezpieczane przed wykonaniem jako kod po stronie usługi generującej dokument, a samo generowanie PDF wymaga jawnie potwierdzonej roli użytkownika. W kalkulatorze dodano ostrzeżenie przy edycji pozycji dodanych przed wersją 1.3, dla których konfiguracja dopłat nie została zapisana i nie da się jej automatycznie odtworzyć. Przebudowano panel danych klienta w kalkulatorze: dane firmy (firma, NIP, adres, SAP ID) zostały oddzielone od danych </w:t>
-            </w:r>
-            <w:r>
-              <w:lastRenderedPageBreak/>
-              <w:t>kontaktowych, a pola „Firma” i „NIP” działają jak wyszukiwarki po katalogu klientów. Osoby kontaktowe są od teraz wspólne dla całego działu - jedna firma może mieć ich wiele, a pole imienia podpowiada je od razu po kliknięciu. Naprawiono także brak natychmiastowej widoczności zmian ustawień administratora (PGL bazowe, kurs EUR/PLN) w kalkulatorze bez przeładowania strony, a PGL bazowe skonfigurowano osobno dla typów stali HRS, CR i HDG. Cena końcowa oraz sumy wartości w kalkulatorze, na liście ofert i w PDF są od teraz zaokrąglane w górę do pełnej jednostki waluty - świadoma decyzja biznesowa, żeby nigdy nie zaniżyć ceny wobec klienta.</w:t>
+              <w:t>Poprawki bezpieczeństwa eksportu PDF: dane oferty i klienta wpisywane przez handlowca są zabezpieczane przed wykonaniem jako kod po stronie usługi generującej dokument, a samo generowanie PDF wymaga jawnie potwierdzonej roli użytkownika. W kalkulatorze dodano ostrzeżenie przy edycji pozycji dodanych przed wersją 1.3, dla których konfiguracja dopłat nie została zapisana i nie da się jej automatycznie odtworzyć. Przebudowano panel danych klienta w kalkulatorze: dane firmy (firma, NIP, adres, SAP ID) zostały oddzielone od danych kontaktowych, a pola „Firma” i „NIP” działają jak wyszukiwarki po katalogu klientów. Osoby kontaktowe są od teraz wspólne dla całego działu - jedna firma może mieć ich wiele, a pole imienia podpowiada je od razu po kliknięciu. Naprawiono także brak natychmiastowej widoczności zmian ustawień administratora (PGL bazowe, kurs EUR/PLN) w kalkulatorze bez przeładowania strony, a PGL bazowe skonfigurowano osobno dla typów stali HRS, CR i HDG. Cena końcowa oraz sumy wartości w kalkulatorze, na liście ofert i w PDF są od teraz zaokrąglane w górę do pełnej jednostki waluty - świadoma decyzja biznesowa, żeby nigdy nie zaniżyć ceny wobec klienta.</w:t>
             </w:r>
           </w:p>
         </w:tc>
@@ -689,7 +688,6 @@
               <w:rPr>
                 <w:b/>
               </w:rPr>
-              <w:lastRenderedPageBreak/>
               <w:t>1.3</w:t>
             </w:r>
           </w:p>
@@ -720,7 +718,11 @@
           </w:tcPr>
           <w:p>
             <w:r>
-              <w:t>Panel administratora zyskał obsługę zatwierdzania, odrzucania i edycji ofert; wysyłka do klienta rozszerzona na starszego handlowca i administratora wraz z zakładkami szybkiego filtrowania; dodane języki czeski i niemiecki oraz sortowanie listy ofert. Dodano panel ustawień administratora (kurs EUR/PLN, PGL bazowe, transport bazowy) oraz przełącznik waluty EURO/PLN w kalkulatorze; oferta zapamiętuje walutę handlowca i kurs z dnia wyceny. Dodano trwałe, unikalne numery ofert wraz z automatyczną nazwą zastępczą „offer_&lt;numer&gt;” dla ofert bez tytułu oraz wyszukiwarkę ofert (po nazwie, nazwie zastępczej i numerze); uprawnienia administratora zrównane ze starszym handlowcem na własnych ofertach.</w:t>
+              <w:t xml:space="preserve">Panel administratora zyskał obsługę zatwierdzania, odrzucania i edycji ofert; wysyłka do klienta rozszerzona na starszego handlowca i administratora wraz z zakładkami </w:t>
+            </w:r>
+            <w:r>
+              <w:lastRenderedPageBreak/>
+              <w:t>szybkiego filtrowania; dodane języki czeski i niemiecki oraz sortowanie listy ofert. Dodano panel ustawień administratora (kurs EUR/PLN, PGL bazowe, transport bazowy) oraz przełącznik waluty EURO/PLN w kalkulatorze; oferta zapamiętuje walutę handlowca i kurs z dnia wyceny. Dodano trwałe, unikalne numery ofert wraz z automatyczną nazwą zastępczą „offer_&lt;numer&gt;” dla ofert bez tytułu oraz wyszukiwarkę ofert (po nazwie, nazwie zastępczej i numerze); uprawnienia administratora zrównane ze starszym handlowcem na własnych ofertach.</w:t>
             </w:r>
           </w:p>
         </w:tc>
@@ -735,6 +737,7 @@
               <w:rPr>
                 <w:b/>
               </w:rPr>
+              <w:lastRenderedPageBreak/>
               <w:t>1.2</w:t>
             </w:r>
           </w:p>
@@ -781,7 +784,6 @@
                 <w:b/>
                 <w:color w:val="1F2A44"/>
               </w:rPr>
-              <w:lastRenderedPageBreak/>
               <w:t>1.1</w:t>
             </w:r>
           </w:p>
@@ -1000,7 +1002,11 @@
           </w:tcPr>
           <w:p>
             <w:r>
-              <w:t>Domyślny termin płatności zmieniony z 7 na 30 dni (migracja 034_payment_term_default_30.sql - do uruchomienia przy wdrożeniu 2.1, bezpieczna w dowolnej kolejności względem kodu). Usunięto preset „2 dni” z wyboru terminu płatności klienta.</w:t>
+              <w:t xml:space="preserve">Domyślny termin płatności zmieniony z 7 na 30 dni (migracja </w:t>
+            </w:r>
+            <w:r>
+              <w:lastRenderedPageBreak/>
+              <w:t>034_payment_term_default_30.sql - do uruchomienia przy wdrożeniu 2.1, bezpieczna w dowolnej kolejności względem kodu). Usunięto preset „2 dni” z wyboru terminu płatności klienta.</w:t>
             </w:r>
           </w:p>
         </w:tc>
@@ -1016,6 +1022,7 @@
           <w:color w:val="2B57A6"/>
           <w:sz w:val="26"/>
         </w:rPr>
+        <w:lastRenderedPageBreak/>
         <w:t>Kalkulator wyceny</w:t>
       </w:r>
     </w:p>
@@ -1039,8 +1046,8 @@
         <w:tblLook w:val="04A0" w:firstRow="1" w:lastRow="0" w:firstColumn="1" w:lastColumn="0" w:noHBand="0" w:noVBand="1"/>
       </w:tblPr>
       <w:tblGrid>
-        <w:gridCol w:w="1963"/>
-        <w:gridCol w:w="6893"/>
+        <w:gridCol w:w="1964"/>
+        <w:gridCol w:w="6892"/>
       </w:tblGrid>
       <w:tr>
         <w:tc>
@@ -1130,8 +1137,8 @@
         <w:tblLook w:val="04A0" w:firstRow="1" w:lastRow="0" w:firstColumn="1" w:lastColumn="0" w:noHBand="0" w:noVBand="1"/>
       </w:tblPr>
       <w:tblGrid>
-        <w:gridCol w:w="1948"/>
-        <w:gridCol w:w="6908"/>
+        <w:gridCol w:w="1947"/>
+        <w:gridCol w:w="6909"/>
       </w:tblGrid>
       <w:tr>
         <w:tc>
@@ -1204,7 +1211,11 @@
           </w:tcPr>
           <w:p>
             <w:r>
-              <w:t>Podsumowanie zmian między wersjami oferty (Moje oferty, Oferty w panelu Administratora, Weryfikacja). Przy numerze każdej wersji (offer_X.N) - także najnowszej - krótka etykieta z maks. 3 najważniejszymi zmianami, np. „HDG 2×1250 +5 t, Wartość oferty +6 082 €” (kolejność: pozycje i tonaż &gt; marża &gt; wartość oferty &gt; reszta, pozostałe jako „+N więcej”); pierwsza wersja: „bazowa · N poz. · X t”. Kliknięcie rozwija pełną listę stara → nowa wartość: dodane/usunięte pozycje, tonaż, marża w punktach procentowych, cena końcowa, transport i dopłaty, trasa, termin płatności, ważność, waluta i kurs, dane klienta, nazwa oferty - oraz autora wersji i zdarzenie: edycja, edycja przez recenzenta, renegocjacja po przegranej. Kierunek zmian ceny jest oznaczony kolorem: wzrost marży, ceny końcowej lub wartości oferty - zielona strzałka ▲, spadek - czerwona ▼ (tonaż i warunki bez koloru). Zmiany samego formularza kalkulatora (bez wpływu na ofertę) są pomijane. Przykład: recenzent podnosi marżę 8% → 9,5% (+1,5 pp) przy 15 t i bazie 1 080 €/t (PGL 1 000 + huta 80) - cena końcowa 1 217 → 1 233 €/t (+16 €/t), wartość oferty 18 246 € → 18 489 € (+243 €).</w:t>
+              <w:t xml:space="preserve">Podsumowanie zmian między wersjami oferty (Moje oferty, Oferty w panelu Administratora, Weryfikacja). Przy numerze każdej wersji (offer_X.N) - także najnowszej - krótka etykieta z maks. 3 najważniejszymi zmianami, np. „HDG 2×1250 +5 t, Wartość oferty +6 082 €” (kolejność: pozycje i tonaż &gt; marża &gt; wartość oferty &gt; reszta, pozostałe jako „+N więcej”); pierwsza wersja: „bazowa · N poz. · X t”. Kliknięcie rozwija pełną listę stara → nowa wartość: dodane/usunięte pozycje, tonaż, marża w punktach procentowych, cena końcowa, transport i dopłaty, trasa, termin płatności, ważność, waluta i kurs, dane klienta, nazwa oferty - oraz autora wersji i zdarzenie: edycja, edycja przez recenzenta, renegocjacja po przegranej. Kierunek zmian ceny jest oznaczony kolorem: wzrost marży, ceny końcowej lub wartości oferty - zielona strzałka ▲, spadek - czerwona ▼ (tonaż i warunki bez koloru). Zmiany samego formularza kalkulatora (bez wpływu na ofertę) są pomijane. Przykład: recenzent podnosi marżę 8% → 9,5% (+1,5 pp) przy 15 t i bazie 1 080 €/t (PGL 1 000 + huta 80) - </w:t>
+            </w:r>
+            <w:r>
+              <w:lastRenderedPageBreak/>
+              <w:t>cena końcowa 1 217 → 1 233 €/t (+16 €/t), wartość oferty 18 246 € → 18 489 € (+243 €).</w:t>
             </w:r>
           </w:p>
         </w:tc>
@@ -1220,6 +1231,7 @@
           <w:color w:val="2B57A6"/>
           <w:sz w:val="26"/>
         </w:rPr>
+        <w:lastRenderedPageBreak/>
         <w:t>Eksport PDF</w:t>
       </w:r>
     </w:p>
@@ -1243,8 +1255,8 @@
         <w:tblLook w:val="04A0" w:firstRow="1" w:lastRow="0" w:firstColumn="1" w:lastColumn="0" w:noHBand="0" w:noVBand="1"/>
       </w:tblPr>
       <w:tblGrid>
-        <w:gridCol w:w="1944"/>
-        <w:gridCol w:w="6912"/>
+        <w:gridCol w:w="1948"/>
+        <w:gridCol w:w="6908"/>
       </w:tblGrid>
       <w:tr>
         <w:tc>
@@ -1424,6 +1436,7 @@
           <w:color w:val="1F2A44"/>
           <w:sz w:val="26"/>
         </w:rPr>
+        <w:lastRenderedPageBreak/>
         <w:t>Znane problemy / prace w toku</w:t>
       </w:r>
     </w:p>
@@ -1541,7 +1554,6 @@
         <w:pStyle w:val="Listapunktowana"/>
       </w:pPr>
       <w:r>
-        <w:lastRenderedPageBreak/>
         <w:t>Po otrzymaniu Excela z oddziałami i regionami: zbudowanie struktury organizacyjnej w aplikacji i kierowanie ofert do właściwego kierownika zamiast wspólnej kolejki.</w:t>
       </w:r>
     </w:p>
@@ -1559,6 +1571,7 @@
         <w:ind w:left="360"/>
       </w:pPr>
       <w:r>
+        <w:lastRenderedPageBreak/>
         <w:t>Po akceptacji brandingu i wyborze jednego z 11 szablonów PDF: przeniesienie go do generatora PDF w aplikacji (4 języki oferty). Po wyborze jednego z 11 wariantów motywu całej strony: wdrożenie go w aplikacji (jasny / ciemny, wysoki kontrast, widok telefonu).</w:t>
       </w:r>
     </w:p>

</xml_diff>

<commit_message>
docs: log price book bulk delta, margin flag and AM branding in v2.1 report, drop v2.2 report
Co-Authored-By: Claude Opus 5.5 <noreply@anthropic.com>
</commit_message>
<xml_diff>
--- a/Historia wersji oraz md/Historia wersji/AMSteel_Quote_Raport_Wersji_2.1.docx
+++ b/Historia wersji oraz md/Historia wersji/AMSteel_Quote_Raport_Wersji_2.1.docx
@@ -282,7 +282,7 @@
           </w:tcPr>
           <w:p>
             <w:r>
-              <w:t>Podgląd pozycji oferty w panelu Administratora oraz kolumny PGL i marża (€/t i %) we wszystkich tabelach pozycji. Podsumowanie zmian między wersjami oferty: krótka etykieta z najważniejszymi zmianami przy każdej wersji, po kliknięciu pełna lista stara → nowa wartość z autorem wersji (nowa kolumna offers.created_by, migracja 033). Nowe szablony oferty PDF zgodne z identyfikacją wizualną ArcelorMittal (11 wariantów do wyboru) oraz 11 wariantów brandingu całej aplikacji. Ważność oferty jako przyciski 24h (domyślnie), 48h lub niestandardowa liczba godzin zamiast wyboru terminu płatności; termin płatności pobierany z ustawień klienta (domyślnie 30 dni od otrzymania faktury, migracja 034), okres ważności oferty bez zmian. Reguła akceptacji „ważność oferty &gt; 48h” (Flow 1 N+2, Flow 2 Head of Projects) liczona z wybranych godzin, a nie z terminu płatności.</w:t>
+              <w:t>Podgląd pozycji oferty w panelu Administratora oraz kolumny PGL i marża (€/t i %) we wszystkich tabelach pozycji. Podsumowanie zmian między wersjami oferty: krótka etykieta z najważniejszymi zmianami przy każdej wersji, po kliknięciu pełna lista stara → nowa wartość z autorem wersji (nowa kolumna offers.created_by, migracja 033). Nowe szablony oferty PDF zgodne z identyfikacją wizualną ArcelorMittal (11 wariantów do wyboru) oraz 11 wariantów brandingu całej aplikacji. Ważność oferty jako przyciski 24h (domyślnie), 48h lub niestandardowa liczba godzin zamiast wyboru terminu płatności; termin płatności pobierany z ustawień klienta (domyślnie 30 dni od otrzymania faktury, migracja 034), okres ważności oferty bez zmian. Reguła akceptacji „ważność oferty &gt; 48h” (Flow 1 N+2, Flow 2 Head of Projects) liczona z wybranych godzin, a nie z terminu płatności. Masowa zmiana cen w cenniku dopłat (/admin/cennik): przy każdej macierzy cen typu stali pole „Zmień każdą cenę o X €/t” z przyciskiem „Zastosuj” oraz przycisk „Zastosuj do wszystkich macierzy” - zmiana trafia do szkicu i wymaga zapisu. Poprawa wizualna: w Zestawieniu kalkulatora marża poniżej ustalonego minimum oznaczona ⚠️ i czerwonym podświetleniem. Wdrożony wybrany branding ArcelorMittal: tryb jasny V6 Aurora, tryb ciemny V3 Midnight (logo AM, font Gilroy) oraz szablon oferty PDF nr 8 (A4 pionowo). Naprawiono przełącznik jasny/ciemny, który zmieniał tylko część ekranu.</w:t>
             </w:r>
           </w:p>
         </w:tc>
@@ -1103,6 +1103,50 @@
           </w:p>
         </w:tc>
       </w:tr>
+      <w:tr>
+        <w:tc>
+          <w:tcPr>
+            <w:tcW w:w="1948" w:type="dxa"/>
+          </w:tcPr>
+          <w:p>
+            <w:r>
+              <w:t>Nowa funkcja</w:t>
+            </w:r>
+          </w:p>
+        </w:tc>
+        <w:tc>
+          <w:tcPr>
+            <w:tcW w:w="6908" w:type="dxa"/>
+          </w:tcPr>
+          <w:p>
+            <w:r>
+              <w:t>Masowa zmiana cen w cenniku dopłat (panel administratora /admin/cennik): obok każdej macierzy cen typu stali pole „Zmień każdą cenę o” (€/t) i przycisk „Zastosuj” - dodaje wpisaną kwotę do każdej komórki z ceną w tej macierzy. Przycisk „Zastosuj do wszystkich macierzy” robi to samo dla wszystkich macierzy wybranego typu stali. Kwota może być ujemna (obniżka), wynik zaokrąglany do 0,01 €/t; komórki bez ceny i komórki z błędnie wpisaną wartością pozostają bez zmian. Zmiana trafia tylko do szkicu - zapis nadal osobnym przyciskiem, z historią zmian jak dotąd. Przykład: komórka 45 €/t i wpisane +12,5 → 57,5 €/t; komórka 100 €/t i -2,5 → 97,5 €/t. Opisy w czterech językach (PL/EN/CS/DE).</w:t>
+            </w:r>
+          </w:p>
+        </w:tc>
+      </w:tr>
+      <w:tr>
+        <w:tc>
+          <w:tcPr>
+            <w:tcW w:w="1948" w:type="dxa"/>
+          </w:tcPr>
+          <w:p>
+            <w:r>
+              <w:t>Poprawka wizualna</w:t>
+            </w:r>
+          </w:p>
+        </w:tc>
+        <w:tc>
+          <w:tcPr>
+            <w:tcW w:w="6908" w:type="dxa"/>
+          </w:tcPr>
+          <w:p>
+            <w:r>
+              <w:t>Zestawienie kalkulatora: marża pozycji ustawiona poniżej minimalnej marży z Ustawień jest oznaczona tym samym znakiem ⚠️ co przy jej ustawianiu oraz czerwonym podświetleniem komórki; podpowiedź po najechaniu podaje próg. Reguła taka sama jak w ocenie oferty (marża % mniejsza od minimum). Przykład: minimum 5%, pozycja z marżą 4,2% - ⚠️ i czerwone tło; pozycja z marżą 5,0% - bez oznaczenia.</w:t>
+            </w:r>
+          </w:p>
+        </w:tc>
+      </w:tr>
     </w:tbl>
     <w:p>
       <w:pPr>
@@ -1334,6 +1378,28 @@
           </w:p>
         </w:tc>
       </w:tr>
+      <w:tr>
+        <w:tc>
+          <w:tcPr>
+            <w:tcW w:w="1948" w:type="dxa"/>
+          </w:tcPr>
+          <w:p>
+            <w:r>
+              <w:t>Zmiana</w:t>
+            </w:r>
+          </w:p>
+        </w:tc>
+        <w:tc>
+          <w:tcPr>
+            <w:tcW w:w="6908" w:type="dxa"/>
+          </w:tcPr>
+          <w:p>
+            <w:r>
+              <w:t>Wdrożony wybrany szablon oferty PDF nr 8 (z 11 wariantów przygotowanych w 2.1): A4 pionowo, logo ArcelorMittal w prawym górnym rogu, cienki pasek gradientu AM w nagłówku, font Gilroy osadzony w PDF, dane odbiorcy w dwóch kolumnach, ciemny nagłówek tabeli pozycji, podsumowanie w osobnej tabeli (nie powtarza się na każdej stronie), warunki w dwóch kolumnach i podpisy w stopce. Treść, kolumny, waluty, ważność oferty, termin płatności i cztery języki oferty bez zmian - zmienia się wyłącznie wygląd. Kontrola kwot (PLN): 908,4 €/t × kurs 4,2512 = 3 861,8 → 3 862 zł/t; pozycja 12,5 t = 48 273 zł, tak jak w poprzednim szablonie.</w:t>
+            </w:r>
+          </w:p>
+        </w:tc>
+      </w:tr>
     </w:tbl>
     <w:p>
       <w:pPr>
@@ -1421,6 +1487,50 @@
           <w:p>
             <w:r>
               <w:t>Warianty brandingu całej aplikacji zgodne z identyfikacją wizualną ArcelorMittal (kontynuacja uwag Karoliny Cisowskiej z 05.10.2026, tym razem dla całego serwisu, nie tylko PDF): przygotowano 11 wariantów motywu do wyboru (folder „Branding - warianty”) obok obecnego wyglądu (V0): V1 Classic Light i V1 Classic Dark (ciepła biel / ciemny, oficjalne kolory logo, cienki pasek gradientu), V2 Gradient Header (pełny gradient AM w pasku aplikacji), V3 Midnight (ciemny grafit, gradient tylko na przyciskach i aktywnych elementach), V4 Plum Executive (fiolet, nawigacja w formie pigułek), V5 Steel Industrial (grafit i stal, ostre rogi, pomarańczowy akcent), V6 Aurora Light (pastelowy gradient AM za matowymi kartami), V7 Swiss Mono (biel i czerń, kolor marki tylko w logo i przycisku głównym), V8 Ember Dark (prawie czarne tło z gradientem w pasku), V9 Warm Sand (kremowy, ciepły pomarańcz) i V10 Magenta Bold (magentowy pasek nagłówka). Każdy wariant pokazany na czterech ekranach (logowanie, kalkulator, oferty, analityka) w widoku komputerowym i telefonicznym, wraz z zestawieniem zbiorczym (00-przeglad-wszystkich.png) i osobnym plikiem CSS na wariant. We wszystkich logo ArcelorMittal w prawym górnym rogu (wersja kolorowa lub biała, zależnie od tła). Funkcjonalność aplikacji bez zmian - zmienia się wyłącznie wygląd. Warianty wysłane do wyboru przez Łukasza - po decyzji wybrany motyw zostanie wdrożony w aplikacji.</w:t>
+            </w:r>
+          </w:p>
+        </w:tc>
+      </w:tr>
+      <w:tr>
+        <w:tc>
+          <w:tcPr>
+            <w:tcW w:w="1948" w:type="dxa"/>
+          </w:tcPr>
+          <w:p>
+            <w:r>
+              <w:t>Zmiana</w:t>
+            </w:r>
+          </w:p>
+        </w:tc>
+        <w:tc>
+          <w:tcPr>
+            <w:tcW w:w="6908" w:type="dxa"/>
+          </w:tcPr>
+          <w:p>
+            <w:r>
+              <w:t>Wdrożony wybrany branding ArcelorMittal całej aplikacji: tryb jasny = wariant V6 Aurora (pastelowy gradient AM za matowymi kartami), tryb ciemny = V3 Midnight (ciepły grafit, gradient na przyciskach i aktywnych elementach). Logo ArcelorMittal zamiast kafelka SSC (kolorowe w trybie jasnym, białe w ciemnym), font Gilroy, kolory AM zamiast niebieskiego akcentu, ekran logowania w nowym stylu. Funkcjonalność aplikacji bez zmian.</w:t>
+            </w:r>
+          </w:p>
+        </w:tc>
+      </w:tr>
+      <w:tr>
+        <w:tc>
+          <w:tcPr>
+            <w:tcW w:w="1948" w:type="dxa"/>
+          </w:tcPr>
+          <w:p>
+            <w:r>
+              <w:t>Poprawka</w:t>
+            </w:r>
+          </w:p>
+        </w:tc>
+        <w:tc>
+          <w:tcPr>
+            <w:tcW w:w="6908" w:type="dxa"/>
+          </w:tcPr>
+          <w:p>
+            <w:r>
+              <w:t>Przełącznik Jasny/Ciemny zmieniał tylko część pól na jasny kolor - aplikacja trzymała motyw w dwóch niezależnych miejscach. Teraz przycisk przełącza motyw całej strony, wybór jest zapamiętany po przeładowaniu i taki sam na ekranie logowania, w kalkulatorze i w panelach.</w:t>
             </w:r>
           </w:p>
         </w:tc>
@@ -1571,8 +1681,7 @@
         <w:ind w:left="360"/>
       </w:pPr>
       <w:r>
-        <w:lastRenderedPageBreak/>
-        <w:t>Po akceptacji brandingu i wyborze jednego z 11 szablonów PDF: przeniesienie go do generatora PDF w aplikacji (4 języki oferty). Po wyborze jednego z 11 wariantów motywu całej strony: wdrożenie go w aplikacji (jasny / ciemny, wysoki kontrast, widok telefonu).</w:t>
+        <w:t>Testy nowego wyglądu (jasny V6 / ciemny V3) i szablonu PDF nr 8 na środowisku produkcyjnym po wdrożeniu; dopracowanie trybu wysokiego kontrastu i widoku telefonu pod nowy branding.</w:t>
       </w:r>
     </w:p>
     <w:tbl>

</xml_diff>